<commit_message>
ML portion in the writeup
</commit_message>
<xml_diff>
--- a/CHF_Research_Paper.docx
+++ b/CHF_Research_Paper.docx
@@ -743,6 +743,3297 @@
         <w:t>None of these five preprocessing decisions were free of consequence, and it is worth restating the finding from Section 1.8 in this context: on one of the hardest test splits used in this project, correcting a handful of data-preprocessing issues, unit errors and a poorly populated column, with no change to the model or to any physics assumption, moved that split's accuracy from an R-squared of 0.173 to 0.711. In this project, the preprocessing choices described above turned out to matter at least as much as which model was ultimately trained on the result.</w:t>
       </w:r>
     </w:p>
+    <w:p>
+      <w:pPr>
+        <w:pStyle w:val="Heading2"/>
+      </w:pPr>
+      <w:r>
+        <w:t>3.2 ML Models</w:t>
+      </w:r>
+    </w:p>
+    <w:p>
+      <w:r>
+        <w:t>The outline for this paper asks for a comparison of at least five algorithms. This project ended up testing considerably more than five, across several distinct phases of experimentation, and it is more honest to describe the five headline models below alongside a summary of everything else that was tried and set aside, rather than presenting only a tidy five-way comparison as if it were the whole story.</w:t>
+      </w:r>
+    </w:p>
+    <w:p>
+      <w:r>
+        <w:t>Model 1, Artificial Neural Network (ANN / MLP). A fully connected multilayer perceptron, trained on the logarithm of CHF rather than the raw value, was this project's primary nonlinear baseline throughout every phase of the work, and a Transformer encoder variant was added later specifically to test whether attention-based architecture offered any advantage over a plain feedforward network. The earliest test of this model, on the 2006 Groeneveld look-up table alone, already showed the pattern that shaped the rest of the project: excellent accuracy under an easy split, and a sharp decline under a genuinely hard one. Table 1 shows this alongside three other baselines evaluated the same way, using three splits of increasing difficulty: Split A, an ordinary random 80/20 split; Split B, an interior pressure holdout; and Split C, an edge-of-range pressure extrapolation, described further in Section 3.4.</w:t>
+      </w:r>
+    </w:p>
+    <w:p>
+      <w:r>
+        <w:rPr>
+          <w:i/>
+          <w:sz w:val="18"/>
+        </w:rPr>
+        <w:t>Table 1. Early baseline comparison on the 2006 Groeneveld look-up table (11,088 usable rows), before any real experimental data was introduced. MAPE is mean absolute percentage error, computed on Split C.</w:t>
+      </w:r>
+    </w:p>
+    <w:tbl>
+      <w:tblPr>
+        <w:tblStyle w:val="LightGrid-Accent1"/>
+        <w:tblW w:type="auto" w:w="0"/>
+        <w:tblLook w:firstColumn="1" w:firstRow="1" w:lastColumn="0" w:lastRow="0" w:noHBand="0" w:noVBand="1" w:val="04A0"/>
+      </w:tblPr>
+      <w:tblGrid>
+        <w:gridCol w:w="1728"/>
+        <w:gridCol w:w="1728"/>
+        <w:gridCol w:w="1728"/>
+        <w:gridCol w:w="1728"/>
+        <w:gridCol w:w="1728"/>
+      </w:tblGrid>
+      <w:tr>
+        <w:tc>
+          <w:tcPr>
+            <w:tcW w:type="dxa" w:w="1728"/>
+          </w:tcPr>
+          <w:p>
+            <w:r>
+              <w:rPr>
+                <w:b/>
+                <w:sz w:val="18"/>
+              </w:rPr>
+              <w:t>Model</w:t>
+            </w:r>
+          </w:p>
+        </w:tc>
+        <w:tc>
+          <w:tcPr>
+            <w:tcW w:type="dxa" w:w="1728"/>
+          </w:tcPr>
+          <w:p>
+            <w:r>
+              <w:rPr>
+                <w:b/>
+                <w:sz w:val="18"/>
+              </w:rPr>
+              <w:t>Split A (R2)</w:t>
+            </w:r>
+          </w:p>
+        </w:tc>
+        <w:tc>
+          <w:tcPr>
+            <w:tcW w:type="dxa" w:w="1728"/>
+          </w:tcPr>
+          <w:p>
+            <w:r>
+              <w:rPr>
+                <w:b/>
+                <w:sz w:val="18"/>
+              </w:rPr>
+              <w:t>Split B (R2)</w:t>
+            </w:r>
+          </w:p>
+        </w:tc>
+        <w:tc>
+          <w:tcPr>
+            <w:tcW w:type="dxa" w:w="1728"/>
+          </w:tcPr>
+          <w:p>
+            <w:r>
+              <w:rPr>
+                <w:b/>
+                <w:sz w:val="18"/>
+              </w:rPr>
+              <w:t>Split C (R2)</w:t>
+            </w:r>
+          </w:p>
+        </w:tc>
+        <w:tc>
+          <w:tcPr>
+            <w:tcW w:type="dxa" w:w="1728"/>
+          </w:tcPr>
+          <w:p>
+            <w:r>
+              <w:rPr>
+                <w:b/>
+                <w:sz w:val="18"/>
+              </w:rPr>
+              <w:t>MAPE on Split C</w:t>
+            </w:r>
+          </w:p>
+        </w:tc>
+      </w:tr>
+      <w:tr>
+        <w:tc>
+          <w:tcPr>
+            <w:tcW w:type="dxa" w:w="1728"/>
+          </w:tcPr>
+          <w:p>
+            <w:r>
+              <w:rPr>
+                <w:sz w:val="18"/>
+              </w:rPr>
+              <w:t>Grid interpolation (physical baseline)</w:t>
+            </w:r>
+          </w:p>
+        </w:tc>
+        <w:tc>
+          <w:tcPr>
+            <w:tcW w:type="dxa" w:w="1728"/>
+          </w:tcPr>
+          <w:p>
+            <w:r>
+              <w:rPr>
+                <w:sz w:val="18"/>
+              </w:rPr>
+              <w:t>N/A</w:t>
+            </w:r>
+          </w:p>
+        </w:tc>
+        <w:tc>
+          <w:tcPr>
+            <w:tcW w:type="dxa" w:w="1728"/>
+          </w:tcPr>
+          <w:p>
+            <w:r>
+              <w:rPr>
+                <w:sz w:val="18"/>
+              </w:rPr>
+              <w:t>0.999</w:t>
+            </w:r>
+          </w:p>
+        </w:tc>
+        <w:tc>
+          <w:tcPr>
+            <w:tcW w:type="dxa" w:w="1728"/>
+          </w:tcPr>
+          <w:p>
+            <w:r>
+              <w:rPr>
+                <w:sz w:val="18"/>
+              </w:rPr>
+              <w:t>0.841</w:t>
+            </w:r>
+          </w:p>
+        </w:tc>
+        <w:tc>
+          <w:tcPr>
+            <w:tcW w:type="dxa" w:w="1728"/>
+          </w:tcPr>
+          <w:p>
+            <w:r>
+              <w:rPr>
+                <w:sz w:val="18"/>
+              </w:rPr>
+              <w:t>20.8%</w:t>
+            </w:r>
+          </w:p>
+        </w:tc>
+      </w:tr>
+      <w:tr>
+        <w:tc>
+          <w:tcPr>
+            <w:tcW w:type="dxa" w:w="1728"/>
+          </w:tcPr>
+          <w:p>
+            <w:r>
+              <w:rPr>
+                <w:sz w:val="18"/>
+              </w:rPr>
+              <w:t>Degree-2 log ridge regression</w:t>
+            </w:r>
+          </w:p>
+        </w:tc>
+        <w:tc>
+          <w:tcPr>
+            <w:tcW w:type="dxa" w:w="1728"/>
+          </w:tcPr>
+          <w:p>
+            <w:r>
+              <w:rPr>
+                <w:sz w:val="18"/>
+              </w:rPr>
+              <w:t>0.847</w:t>
+            </w:r>
+          </w:p>
+        </w:tc>
+        <w:tc>
+          <w:tcPr>
+            <w:tcW w:type="dxa" w:w="1728"/>
+          </w:tcPr>
+          <w:p>
+            <w:r>
+              <w:rPr>
+                <w:sz w:val="18"/>
+              </w:rPr>
+              <w:t>0.871</w:t>
+            </w:r>
+          </w:p>
+        </w:tc>
+        <w:tc>
+          <w:tcPr>
+            <w:tcW w:type="dxa" w:w="1728"/>
+          </w:tcPr>
+          <w:p>
+            <w:r>
+              <w:rPr>
+                <w:sz w:val="18"/>
+              </w:rPr>
+              <w:t>0.755</w:t>
+            </w:r>
+          </w:p>
+        </w:tc>
+        <w:tc>
+          <w:tcPr>
+            <w:tcW w:type="dxa" w:w="1728"/>
+          </w:tcPr>
+          <w:p>
+            <w:r>
+              <w:rPr>
+                <w:sz w:val="18"/>
+              </w:rPr>
+              <w:t>35.8%</w:t>
+            </w:r>
+          </w:p>
+        </w:tc>
+      </w:tr>
+      <w:tr>
+        <w:tc>
+          <w:tcPr>
+            <w:tcW w:type="dxa" w:w="1728"/>
+          </w:tcPr>
+          <w:p>
+            <w:r>
+              <w:rPr>
+                <w:sz w:val="18"/>
+              </w:rPr>
+              <w:t>Neural network, ANN (log target)</w:t>
+            </w:r>
+          </w:p>
+        </w:tc>
+        <w:tc>
+          <w:tcPr>
+            <w:tcW w:type="dxa" w:w="1728"/>
+          </w:tcPr>
+          <w:p>
+            <w:r>
+              <w:rPr>
+                <w:sz w:val="18"/>
+              </w:rPr>
+              <w:t>0.991</w:t>
+            </w:r>
+          </w:p>
+        </w:tc>
+        <w:tc>
+          <w:tcPr>
+            <w:tcW w:type="dxa" w:w="1728"/>
+          </w:tcPr>
+          <w:p>
+            <w:r>
+              <w:rPr>
+                <w:sz w:val="18"/>
+              </w:rPr>
+              <w:t>0.989</w:t>
+            </w:r>
+          </w:p>
+        </w:tc>
+        <w:tc>
+          <w:tcPr>
+            <w:tcW w:type="dxa" w:w="1728"/>
+          </w:tcPr>
+          <w:p>
+            <w:r>
+              <w:rPr>
+                <w:sz w:val="18"/>
+              </w:rPr>
+              <w:t>0.628 +/- 0.072</w:t>
+            </w:r>
+          </w:p>
+        </w:tc>
+        <w:tc>
+          <w:tcPr>
+            <w:tcW w:type="dxa" w:w="1728"/>
+          </w:tcPr>
+          <w:p>
+            <w:r>
+              <w:rPr>
+                <w:sz w:val="18"/>
+              </w:rPr>
+              <w:t>40.0%</w:t>
+            </w:r>
+          </w:p>
+        </w:tc>
+      </w:tr>
+      <w:tr>
+        <w:tc>
+          <w:tcPr>
+            <w:tcW w:type="dxa" w:w="1728"/>
+          </w:tcPr>
+          <w:p>
+            <w:r>
+              <w:rPr>
+                <w:sz w:val="18"/>
+              </w:rPr>
+              <w:t>Tree ensembles (Random Forest, gradient boosting variants)</w:t>
+            </w:r>
+          </w:p>
+        </w:tc>
+        <w:tc>
+          <w:tcPr>
+            <w:tcW w:type="dxa" w:w="1728"/>
+          </w:tcPr>
+          <w:p>
+            <w:r>
+              <w:rPr>
+                <w:sz w:val="18"/>
+              </w:rPr>
+              <w:t>0.999</w:t>
+            </w:r>
+          </w:p>
+        </w:tc>
+        <w:tc>
+          <w:tcPr>
+            <w:tcW w:type="dxa" w:w="1728"/>
+          </w:tcPr>
+          <w:p>
+            <w:r>
+              <w:rPr>
+                <w:sz w:val="18"/>
+              </w:rPr>
+              <w:t>0.988</w:t>
+            </w:r>
+          </w:p>
+        </w:tc>
+        <w:tc>
+          <w:tcPr>
+            <w:tcW w:type="dxa" w:w="1728"/>
+          </w:tcPr>
+          <w:p>
+            <w:r>
+              <w:rPr>
+                <w:sz w:val="18"/>
+              </w:rPr>
+              <w:t>about 0.43</w:t>
+            </w:r>
+          </w:p>
+        </w:tc>
+        <w:tc>
+          <w:tcPr>
+            <w:tcW w:type="dxa" w:w="1728"/>
+          </w:tcPr>
+          <w:p>
+            <w:r>
+              <w:rPr>
+                <w:sz w:val="18"/>
+              </w:rPr>
+              <w:t>about 42%</w:t>
+            </w:r>
+          </w:p>
+        </w:tc>
+      </w:tr>
+      <w:tr>
+        <w:tc>
+          <w:tcPr>
+            <w:tcW w:type="dxa" w:w="1728"/>
+          </w:tcPr>
+          <w:p>
+            <w:r>
+              <w:rPr>
+                <w:sz w:val="18"/>
+              </w:rPr>
+              <w:t>Pressure-gated blend (raw target)</w:t>
+            </w:r>
+          </w:p>
+        </w:tc>
+        <w:tc>
+          <w:tcPr>
+            <w:tcW w:type="dxa" w:w="1728"/>
+          </w:tcPr>
+          <w:p>
+            <w:r>
+              <w:rPr>
+                <w:sz w:val="18"/>
+              </w:rPr>
+              <w:t>0.999</w:t>
+            </w:r>
+          </w:p>
+        </w:tc>
+        <w:tc>
+          <w:tcPr>
+            <w:tcW w:type="dxa" w:w="1728"/>
+          </w:tcPr>
+          <w:p>
+            <w:r>
+              <w:rPr>
+                <w:sz w:val="18"/>
+              </w:rPr>
+              <w:t>0.999</w:t>
+            </w:r>
+          </w:p>
+        </w:tc>
+        <w:tc>
+          <w:tcPr>
+            <w:tcW w:type="dxa" w:w="1728"/>
+          </w:tcPr>
+          <w:p>
+            <w:r>
+              <w:rPr>
+                <w:sz w:val="18"/>
+              </w:rPr>
+              <w:t>0.466 +/- 0.228</w:t>
+            </w:r>
+          </w:p>
+        </w:tc>
+        <w:tc>
+          <w:tcPr>
+            <w:tcW w:type="dxa" w:w="1728"/>
+          </w:tcPr>
+          <w:p>
+            <w:r>
+              <w:rPr>
+                <w:sz w:val="18"/>
+              </w:rPr>
+              <w:t>67.1%</w:t>
+            </w:r>
+          </w:p>
+        </w:tc>
+      </w:tr>
+    </w:tbl>
+    <w:p/>
+    <w:p>
+      <w:r>
+        <w:t>Two things from this early phase carried forward into everything that followed. First, deterministic grid interpolation, simply reading the value off the look-up table itself with no learning involved, held its accuracy far better than any learned model under genuine extrapolation, the first sign that a physical anchor might matter more than model choice. Second, an internal review had initially ranked a different blend first, at an R-squared of 0.855 on Split C, but multi-seed verification showed that result did not replicate, the underlying model averaged 0.547 across 30 random seeds and not one seed reached 0.84 on its own. The claim was withdrawn, and from that point on, every number in this project is reported as a multi-seed mean, never a single run.</w:t>
+      </w:r>
+    </w:p>
+    <w:p>
+      <w:r>
+        <w:t>Model 2, Random Forest. A random forest builds a large number of decision trees on randomly resampled subsets of the data and features, then averages their predictions, which the outline correctly identifies as useful for capturing nonlinear relationships, ranking feature importance, and providing a fairly robust baseline that rarely fails outright. This project's own testing on the seven-source, 28,470-row merged dataset confirmed the first two points and complicated the third: random forest was consistently strong under easier splits but degraded considerably faster than gradient boosting once the test conditions became genuinely unseen.</w:t>
+      </w:r>
+    </w:p>
+    <w:p>
+      <w:r>
+        <w:t>Model 3, Gradient Boosting. Gradient boosting builds trees sequentially, with each new tree correcting the errors left by the ones before it, and the outline specifically names XGBoost as a strong candidate for structured, tabular experimental data such as this project's own. The implementation actually trained and evaluated in this project's own bake-off was a histogram-based gradient boosting model rather than the XGBoost package specifically, and it is worth being precise about that distinction rather than blurring the two together. Section 1.5 already reviews XGBoost results from the wider published literature, where it reaches an R-squared above 0.94 on rod-bundle CHF data, close behind a Transformer architecture's 0.956. Within this project's own testing, the gradient boosting model it did train turned out to be the strongest or joint-strongest performer of every model compared, under every one of the four validation strategies used, as Table 2 shows.</w:t>
+      </w:r>
+    </w:p>
+    <w:p>
+      <w:r>
+        <w:rPr>
+          <w:i/>
+          <w:sz w:val="18"/>
+        </w:rPr>
+        <w:t>Table 2. Model comparison across four validation strategies, evaluated on the same seven-source, 28,470-row merged dataset (includes pin-fin and helical-coil pool-boiling surfaces). Strategies are defined in Section 3.4.</w:t>
+      </w:r>
+    </w:p>
+    <w:tbl>
+      <w:tblPr>
+        <w:tblStyle w:val="LightGrid-Accent1"/>
+        <w:tblW w:type="auto" w:w="0"/>
+        <w:tblLook w:firstColumn="1" w:firstRow="1" w:lastColumn="0" w:lastRow="0" w:noHBand="0" w:noVBand="1" w:val="04A0"/>
+      </w:tblPr>
+      <w:tblGrid>
+        <w:gridCol w:w="1728"/>
+        <w:gridCol w:w="1728"/>
+        <w:gridCol w:w="1728"/>
+        <w:gridCol w:w="1728"/>
+        <w:gridCol w:w="1728"/>
+      </w:tblGrid>
+      <w:tr>
+        <w:tc>
+          <w:tcPr>
+            <w:tcW w:type="dxa" w:w="1728"/>
+          </w:tcPr>
+          <w:p>
+            <w:r>
+              <w:rPr>
+                <w:b/>
+                <w:sz w:val="18"/>
+              </w:rPr>
+              <w:t>Model</w:t>
+            </w:r>
+          </w:p>
+        </w:tc>
+        <w:tc>
+          <w:tcPr>
+            <w:tcW w:type="dxa" w:w="1728"/>
+          </w:tcPr>
+          <w:p>
+            <w:r>
+              <w:rPr>
+                <w:b/>
+                <w:sz w:val="18"/>
+              </w:rPr>
+              <w:t>Strategy 1: Random (R2)</w:t>
+            </w:r>
+          </w:p>
+        </w:tc>
+        <w:tc>
+          <w:tcPr>
+            <w:tcW w:type="dxa" w:w="1728"/>
+          </w:tcPr>
+          <w:p>
+            <w:r>
+              <w:rPr>
+                <w:b/>
+                <w:sz w:val="18"/>
+              </w:rPr>
+              <w:t>Strategy 2: Condition-wise (R2)</w:t>
+            </w:r>
+          </w:p>
+        </w:tc>
+        <w:tc>
+          <w:tcPr>
+            <w:tcW w:type="dxa" w:w="1728"/>
+          </w:tcPr>
+          <w:p>
+            <w:r>
+              <w:rPr>
+                <w:b/>
+                <w:sz w:val="18"/>
+              </w:rPr>
+              <w:t>Strategy 3: Surface-wise (R2)</w:t>
+            </w:r>
+          </w:p>
+        </w:tc>
+        <w:tc>
+          <w:tcPr>
+            <w:tcW w:type="dxa" w:w="1728"/>
+          </w:tcPr>
+          <w:p>
+            <w:r>
+              <w:rPr>
+                <w:b/>
+                <w:sz w:val="18"/>
+              </w:rPr>
+              <w:t>Strategy 4: Leave-one-source-out (R2)</w:t>
+            </w:r>
+          </w:p>
+        </w:tc>
+      </w:tr>
+      <w:tr>
+        <w:tc>
+          <w:tcPr>
+            <w:tcW w:type="dxa" w:w="1728"/>
+          </w:tcPr>
+          <w:p>
+            <w:r>
+              <w:rPr>
+                <w:sz w:val="18"/>
+              </w:rPr>
+              <w:t>Gradient boosting (histogram-based)</w:t>
+            </w:r>
+          </w:p>
+        </w:tc>
+        <w:tc>
+          <w:tcPr>
+            <w:tcW w:type="dxa" w:w="1728"/>
+          </w:tcPr>
+          <w:p>
+            <w:r>
+              <w:rPr>
+                <w:sz w:val="18"/>
+              </w:rPr>
+              <w:t>0.968</w:t>
+            </w:r>
+          </w:p>
+        </w:tc>
+        <w:tc>
+          <w:tcPr>
+            <w:tcW w:type="dxa" w:w="1728"/>
+          </w:tcPr>
+          <w:p>
+            <w:r>
+              <w:rPr>
+                <w:sz w:val="18"/>
+              </w:rPr>
+              <w:t>0.890</w:t>
+            </w:r>
+          </w:p>
+        </w:tc>
+        <w:tc>
+          <w:tcPr>
+            <w:tcW w:type="dxa" w:w="1728"/>
+          </w:tcPr>
+          <w:p>
+            <w:r>
+              <w:rPr>
+                <w:sz w:val="18"/>
+              </w:rPr>
+              <w:t>0.173</w:t>
+            </w:r>
+          </w:p>
+        </w:tc>
+        <w:tc>
+          <w:tcPr>
+            <w:tcW w:type="dxa" w:w="1728"/>
+          </w:tcPr>
+          <w:p>
+            <w:r>
+              <w:rPr>
+                <w:sz w:val="18"/>
+              </w:rPr>
+              <w:t>0.784</w:t>
+            </w:r>
+          </w:p>
+        </w:tc>
+      </w:tr>
+      <w:tr>
+        <w:tc>
+          <w:tcPr>
+            <w:tcW w:type="dxa" w:w="1728"/>
+          </w:tcPr>
+          <w:p>
+            <w:r>
+              <w:rPr>
+                <w:sz w:val="18"/>
+              </w:rPr>
+              <w:t>Random Forest</w:t>
+            </w:r>
+          </w:p>
+        </w:tc>
+        <w:tc>
+          <w:tcPr>
+            <w:tcW w:type="dxa" w:w="1728"/>
+          </w:tcPr>
+          <w:p>
+            <w:r>
+              <w:rPr>
+                <w:sz w:val="18"/>
+              </w:rPr>
+              <w:t>0.965</w:t>
+            </w:r>
+          </w:p>
+        </w:tc>
+        <w:tc>
+          <w:tcPr>
+            <w:tcW w:type="dxa" w:w="1728"/>
+          </w:tcPr>
+          <w:p>
+            <w:r>
+              <w:rPr>
+                <w:sz w:val="18"/>
+              </w:rPr>
+              <w:t>0.875</w:t>
+            </w:r>
+          </w:p>
+        </w:tc>
+        <w:tc>
+          <w:tcPr>
+            <w:tcW w:type="dxa" w:w="1728"/>
+          </w:tcPr>
+          <w:p>
+            <w:r>
+              <w:rPr>
+                <w:sz w:val="18"/>
+              </w:rPr>
+              <w:t>0.219</w:t>
+            </w:r>
+          </w:p>
+        </w:tc>
+        <w:tc>
+          <w:tcPr>
+            <w:tcW w:type="dxa" w:w="1728"/>
+          </w:tcPr>
+          <w:p>
+            <w:r>
+              <w:rPr>
+                <w:sz w:val="18"/>
+              </w:rPr>
+              <w:t>0.269</w:t>
+            </w:r>
+          </w:p>
+        </w:tc>
+      </w:tr>
+      <w:tr>
+        <w:tc>
+          <w:tcPr>
+            <w:tcW w:type="dxa" w:w="1728"/>
+          </w:tcPr>
+          <w:p>
+            <w:r>
+              <w:rPr>
+                <w:sz w:val="18"/>
+              </w:rPr>
+              <w:t>Neural network (ANN)</w:t>
+            </w:r>
+          </w:p>
+        </w:tc>
+        <w:tc>
+          <w:tcPr>
+            <w:tcW w:type="dxa" w:w="1728"/>
+          </w:tcPr>
+          <w:p>
+            <w:r>
+              <w:rPr>
+                <w:sz w:val="18"/>
+              </w:rPr>
+              <w:t>0.921</w:t>
+            </w:r>
+          </w:p>
+        </w:tc>
+        <w:tc>
+          <w:tcPr>
+            <w:tcW w:type="dxa" w:w="1728"/>
+          </w:tcPr>
+          <w:p>
+            <w:r>
+              <w:rPr>
+                <w:sz w:val="18"/>
+              </w:rPr>
+              <w:t>0.515</w:t>
+            </w:r>
+          </w:p>
+        </w:tc>
+        <w:tc>
+          <w:tcPr>
+            <w:tcW w:type="dxa" w:w="1728"/>
+          </w:tcPr>
+          <w:p>
+            <w:r>
+              <w:rPr>
+                <w:sz w:val="18"/>
+              </w:rPr>
+              <w:t>-4132.9</w:t>
+            </w:r>
+          </w:p>
+        </w:tc>
+        <w:tc>
+          <w:tcPr>
+            <w:tcW w:type="dxa" w:w="1728"/>
+          </w:tcPr>
+          <w:p>
+            <w:r>
+              <w:rPr>
+                <w:sz w:val="18"/>
+              </w:rPr>
+              <w:t>-5.150</w:t>
+            </w:r>
+          </w:p>
+        </w:tc>
+      </w:tr>
+      <w:tr>
+        <w:tc>
+          <w:tcPr>
+            <w:tcW w:type="dxa" w:w="1728"/>
+          </w:tcPr>
+          <w:p>
+            <w:r>
+              <w:rPr>
+                <w:sz w:val="18"/>
+              </w:rPr>
+              <w:t>Gaussian Process Regression</w:t>
+            </w:r>
+          </w:p>
+        </w:tc>
+        <w:tc>
+          <w:tcPr>
+            <w:tcW w:type="dxa" w:w="1728"/>
+          </w:tcPr>
+          <w:p>
+            <w:r>
+              <w:rPr>
+                <w:sz w:val="18"/>
+              </w:rPr>
+              <w:t>0.872</w:t>
+            </w:r>
+          </w:p>
+        </w:tc>
+        <w:tc>
+          <w:tcPr>
+            <w:tcW w:type="dxa" w:w="1728"/>
+          </w:tcPr>
+          <w:p>
+            <w:r>
+              <w:rPr>
+                <w:sz w:val="18"/>
+              </w:rPr>
+              <w:t>-0.051</w:t>
+            </w:r>
+          </w:p>
+        </w:tc>
+        <w:tc>
+          <w:tcPr>
+            <w:tcW w:type="dxa" w:w="1728"/>
+          </w:tcPr>
+          <w:p>
+            <w:r>
+              <w:rPr>
+                <w:sz w:val="18"/>
+              </w:rPr>
+              <w:t>-0.813</w:t>
+            </w:r>
+          </w:p>
+        </w:tc>
+        <w:tc>
+          <w:tcPr>
+            <w:tcW w:type="dxa" w:w="1728"/>
+          </w:tcPr>
+          <w:p>
+            <w:r>
+              <w:rPr>
+                <w:sz w:val="18"/>
+              </w:rPr>
+              <w:t>0.539</w:t>
+            </w:r>
+          </w:p>
+        </w:tc>
+      </w:tr>
+      <w:tr>
+        <w:tc>
+          <w:tcPr>
+            <w:tcW w:type="dxa" w:w="1728"/>
+          </w:tcPr>
+          <w:p>
+            <w:r>
+              <w:rPr>
+                <w:sz w:val="18"/>
+              </w:rPr>
+              <w:t>Physics-informed neural network (PINN)</w:t>
+            </w:r>
+          </w:p>
+        </w:tc>
+        <w:tc>
+          <w:tcPr>
+            <w:tcW w:type="dxa" w:w="1728"/>
+          </w:tcPr>
+          <w:p>
+            <w:r>
+              <w:rPr>
+                <w:sz w:val="18"/>
+              </w:rPr>
+              <w:t>0.876</w:t>
+            </w:r>
+          </w:p>
+        </w:tc>
+        <w:tc>
+          <w:tcPr>
+            <w:tcW w:type="dxa" w:w="1728"/>
+          </w:tcPr>
+          <w:p>
+            <w:r>
+              <w:rPr>
+                <w:sz w:val="18"/>
+              </w:rPr>
+              <w:t>-64.9</w:t>
+            </w:r>
+          </w:p>
+        </w:tc>
+        <w:tc>
+          <w:tcPr>
+            <w:tcW w:type="dxa" w:w="1728"/>
+          </w:tcPr>
+          <w:p>
+            <w:r>
+              <w:rPr>
+                <w:sz w:val="18"/>
+              </w:rPr>
+              <w:t>-3906.9</w:t>
+            </w:r>
+          </w:p>
+        </w:tc>
+        <w:tc>
+          <w:tcPr>
+            <w:tcW w:type="dxa" w:w="1728"/>
+          </w:tcPr>
+          <w:p>
+            <w:r>
+              <w:rPr>
+                <w:sz w:val="18"/>
+              </w:rPr>
+              <w:t>-6.022</w:t>
+            </w:r>
+          </w:p>
+        </w:tc>
+      </w:tr>
+    </w:tbl>
+    <w:p/>
+    <w:p>
+      <w:r>
+        <w:t>The physics-informed neural network in Table 2 deserves a brief, honest note, since this project spent considerable effort on it before setting it aside. Early results looked promising when the target was reparameterized as a residual correction, reaching an R-squared of 0.847 against a deterministic baseline of 0.841. On closer inspection, however, the monotonicity penalty that was supposed to enforce physical behavior read exactly zero throughout training, meaning it was never actually active, and the best-performing configuration had a fitted weight of zero on both of its physics penalty terms. In other words, the apparent gain came from how the target was framed, not from any physics constraint actually doing work, and Table 2 shows the same model collapsing to an R-squared of minus 64.9 and minus 3900 under harder splits. Combined with the fact that CHF has no governing partial differential equation for a physics-informed network to enforce in the first place, this project moved away from the physics-informed neural network as a standalone architecture and toward the residual-correction-on-a-correlation approach described under Model 5 below, which keeps the physical anchor but does not depend on an unstable penalty term.</w:t>
+      </w:r>
+    </w:p>
+    <w:p>
+      <w:r>
+        <w:t>Model 4, physics correlation baseline (zero fitted parameters). Alongside the four learned models above, this project also carried a purely physical model through every comparison: an empirical CHF correlation, such as Katto and Ohno's, the Biasi correlation, or the 2006 Groeneveld look-up table itself, chosen automatically for whichever training subset was being evaluated, with no fitted parameters of its own. In a later, more tightly scoped phase of this project, restricted specifically to flow boiling and using a different, eight-source, 28,582-row dataset than Table 2, this physics-only baseline was compared against several learned models under the same four validation strategies, shown in Table 3.</w:t>
+      </w:r>
+    </w:p>
+    <w:p>
+      <w:r>
+        <w:rPr>
+          <w:i/>
+          <w:sz w:val="18"/>
+        </w:rPr>
+        <w:t>Table 3. Physics-only baseline versus learned models, flow-boiling-only dataset (eight sources, 28,582 rows), same four validation strategies as Table 2.</w:t>
+      </w:r>
+    </w:p>
+    <w:tbl>
+      <w:tblPr>
+        <w:tblStyle w:val="LightGrid-Accent1"/>
+        <w:tblW w:type="auto" w:w="0"/>
+        <w:tblLook w:firstColumn="1" w:firstRow="1" w:lastColumn="0" w:lastRow="0" w:noHBand="0" w:noVBand="1" w:val="04A0"/>
+      </w:tblPr>
+      <w:tblGrid>
+        <w:gridCol w:w="1728"/>
+        <w:gridCol w:w="1728"/>
+        <w:gridCol w:w="1728"/>
+        <w:gridCol w:w="1728"/>
+        <w:gridCol w:w="1728"/>
+      </w:tblGrid>
+      <w:tr>
+        <w:tc>
+          <w:tcPr>
+            <w:tcW w:type="dxa" w:w="1728"/>
+          </w:tcPr>
+          <w:p>
+            <w:r>
+              <w:rPr>
+                <w:b/>
+                <w:sz w:val="18"/>
+              </w:rPr>
+              <w:t>Model</w:t>
+            </w:r>
+          </w:p>
+        </w:tc>
+        <w:tc>
+          <w:tcPr>
+            <w:tcW w:type="dxa" w:w="1728"/>
+          </w:tcPr>
+          <w:p>
+            <w:r>
+              <w:rPr>
+                <w:b/>
+                <w:sz w:val="18"/>
+              </w:rPr>
+              <w:t>Strategy 1: Random (R2)</w:t>
+            </w:r>
+          </w:p>
+        </w:tc>
+        <w:tc>
+          <w:tcPr>
+            <w:tcW w:type="dxa" w:w="1728"/>
+          </w:tcPr>
+          <w:p>
+            <w:r>
+              <w:rPr>
+                <w:b/>
+                <w:sz w:val="18"/>
+              </w:rPr>
+              <w:t>Strategy 2: Condition-wise (R2)</w:t>
+            </w:r>
+          </w:p>
+        </w:tc>
+        <w:tc>
+          <w:tcPr>
+            <w:tcW w:type="dxa" w:w="1728"/>
+          </w:tcPr>
+          <w:p>
+            <w:r>
+              <w:rPr>
+                <w:b/>
+                <w:sz w:val="18"/>
+              </w:rPr>
+              <w:t>Strategy 3: Surface-wise (R2)</w:t>
+            </w:r>
+          </w:p>
+        </w:tc>
+        <w:tc>
+          <w:tcPr>
+            <w:tcW w:type="dxa" w:w="1728"/>
+          </w:tcPr>
+          <w:p>
+            <w:r>
+              <w:rPr>
+                <w:b/>
+                <w:sz w:val="18"/>
+              </w:rPr>
+              <w:t>Strategy 4: Leave-one-source-out (R2)</w:t>
+            </w:r>
+          </w:p>
+        </w:tc>
+      </w:tr>
+      <w:tr>
+        <w:tc>
+          <w:tcPr>
+            <w:tcW w:type="dxa" w:w="1728"/>
+          </w:tcPr>
+          <w:p>
+            <w:r>
+              <w:rPr>
+                <w:sz w:val="18"/>
+              </w:rPr>
+              <w:t>Physics only (Katto-Ohno), no learning</w:t>
+            </w:r>
+          </w:p>
+        </w:tc>
+        <w:tc>
+          <w:tcPr>
+            <w:tcW w:type="dxa" w:w="1728"/>
+          </w:tcPr>
+          <w:p>
+            <w:r>
+              <w:rPr>
+                <w:sz w:val="18"/>
+              </w:rPr>
+              <w:t>0.779</w:t>
+            </w:r>
+          </w:p>
+        </w:tc>
+        <w:tc>
+          <w:tcPr>
+            <w:tcW w:type="dxa" w:w="1728"/>
+          </w:tcPr>
+          <w:p>
+            <w:r>
+              <w:rPr>
+                <w:sz w:val="18"/>
+              </w:rPr>
+              <w:t>0.508</w:t>
+            </w:r>
+          </w:p>
+        </w:tc>
+        <w:tc>
+          <w:tcPr>
+            <w:tcW w:type="dxa" w:w="1728"/>
+          </w:tcPr>
+          <w:p>
+            <w:r>
+              <w:rPr>
+                <w:sz w:val="18"/>
+              </w:rPr>
+              <w:t>0.505</w:t>
+            </w:r>
+          </w:p>
+        </w:tc>
+        <w:tc>
+          <w:tcPr>
+            <w:tcW w:type="dxa" w:w="1728"/>
+          </w:tcPr>
+          <w:p>
+            <w:r>
+              <w:rPr>
+                <w:sz w:val="18"/>
+              </w:rPr>
+              <w:t>0.785</w:t>
+            </w:r>
+          </w:p>
+        </w:tc>
+      </w:tr>
+      <w:tr>
+        <w:tc>
+          <w:tcPr>
+            <w:tcW w:type="dxa" w:w="1728"/>
+          </w:tcPr>
+          <w:p>
+            <w:r>
+              <w:rPr>
+                <w:sz w:val="18"/>
+              </w:rPr>
+              <w:t>No physics, raw features (data-driven only)</w:t>
+            </w:r>
+          </w:p>
+        </w:tc>
+        <w:tc>
+          <w:tcPr>
+            <w:tcW w:type="dxa" w:w="1728"/>
+          </w:tcPr>
+          <w:p>
+            <w:r>
+              <w:rPr>
+                <w:sz w:val="18"/>
+              </w:rPr>
+              <w:t>0.979</w:t>
+            </w:r>
+          </w:p>
+        </w:tc>
+        <w:tc>
+          <w:tcPr>
+            <w:tcW w:type="dxa" w:w="1728"/>
+          </w:tcPr>
+          <w:p>
+            <w:r>
+              <w:rPr>
+                <w:sz w:val="18"/>
+              </w:rPr>
+              <w:t>0.903</w:t>
+            </w:r>
+          </w:p>
+        </w:tc>
+        <w:tc>
+          <w:tcPr>
+            <w:tcW w:type="dxa" w:w="1728"/>
+          </w:tcPr>
+          <w:p>
+            <w:r>
+              <w:rPr>
+                <w:sz w:val="18"/>
+              </w:rPr>
+              <w:t>-17.997</w:t>
+            </w:r>
+          </w:p>
+        </w:tc>
+        <w:tc>
+          <w:tcPr>
+            <w:tcW w:type="dxa" w:w="1728"/>
+          </w:tcPr>
+          <w:p>
+            <w:r>
+              <w:rPr>
+                <w:sz w:val="18"/>
+              </w:rPr>
+              <w:t>0.719</w:t>
+            </w:r>
+          </w:p>
+        </w:tc>
+      </w:tr>
+    </w:tbl>
+    <w:p/>
+    <w:p>
+      <w:r>
+        <w:t>The pattern is the same one seen throughout this paper: the purely data-driven model wins comfortably when the split is easy and can collapse badly when it is not, in this case to an R-squared of minus 18 under a surface-wise split, while the physics-only baseline never scores as high but never collapses either, staying within a narrow band of 0.5 to 0.79 across every split tested. That stability, not raw accuracy, is exactly what a physical floor is meant to provide, and it is the reason Model 4 was kept as a component of Model 5 rather than replaced by it.</w:t>
+      </w:r>
+    </w:p>
+    <w:p>
+      <w:r>
+        <w:t>Model 5, Proposed hybrid architecture. Rather than choosing between a data-driven model and a physics correlation, the model proposed in this paper combines both, using the physics correlation as a floor and a learned model only to correct it. The full hierarchy is described in Section 3.3. Evaluated on the same entirely unseen datasets used to test generalization elsewhere in this paper, this hybrid consistently outperformed both of its own ingredients taken alone, as Table 4 shows.</w:t>
+      </w:r>
+    </w:p>
+    <w:p>
+      <w:r>
+        <w:rPr>
+          <w:i/>
+          <w:sz w:val="18"/>
+        </w:rPr>
+        <w:t>Table 4. Performance on entirely unseen datasets: physics alone, a purely data-driven model with no physics, and the proposed hybrid pipeline, evaluated dataset by dataset (flow-boiling-only data, eight sources).</w:t>
+      </w:r>
+    </w:p>
+    <w:tbl>
+      <w:tblPr>
+        <w:tblStyle w:val="LightGrid-Accent1"/>
+        <w:tblW w:type="auto" w:w="0"/>
+        <w:tblLook w:firstColumn="1" w:firstRow="1" w:lastColumn="0" w:lastRow="0" w:noHBand="0" w:noVBand="1" w:val="04A0"/>
+      </w:tblPr>
+      <w:tblGrid>
+        <w:gridCol w:w="1728"/>
+        <w:gridCol w:w="1728"/>
+        <w:gridCol w:w="1728"/>
+        <w:gridCol w:w="1728"/>
+        <w:gridCol w:w="1728"/>
+      </w:tblGrid>
+      <w:tr>
+        <w:tc>
+          <w:tcPr>
+            <w:tcW w:type="dxa" w:w="1728"/>
+          </w:tcPr>
+          <w:p>
+            <w:r>
+              <w:rPr>
+                <w:b/>
+                <w:sz w:val="18"/>
+              </w:rPr>
+              <w:t>Unseen dataset</w:t>
+            </w:r>
+          </w:p>
+        </w:tc>
+        <w:tc>
+          <w:tcPr>
+            <w:tcW w:type="dxa" w:w="1728"/>
+          </w:tcPr>
+          <w:p>
+            <w:r>
+              <w:rPr>
+                <w:b/>
+                <w:sz w:val="18"/>
+              </w:rPr>
+              <w:t>Physics alone (R2)</w:t>
+            </w:r>
+          </w:p>
+        </w:tc>
+        <w:tc>
+          <w:tcPr>
+            <w:tcW w:type="dxa" w:w="1728"/>
+          </w:tcPr>
+          <w:p>
+            <w:r>
+              <w:rPr>
+                <w:b/>
+                <w:sz w:val="18"/>
+              </w:rPr>
+              <w:t>ML, no physics (R2)</w:t>
+            </w:r>
+          </w:p>
+        </w:tc>
+        <w:tc>
+          <w:tcPr>
+            <w:tcW w:type="dxa" w:w="1728"/>
+          </w:tcPr>
+          <w:p>
+            <w:r>
+              <w:rPr>
+                <w:b/>
+                <w:sz w:val="18"/>
+              </w:rPr>
+              <w:t>Proposed hybrid (R2)</w:t>
+            </w:r>
+          </w:p>
+        </w:tc>
+        <w:tc>
+          <w:tcPr>
+            <w:tcW w:type="dxa" w:w="1728"/>
+          </w:tcPr>
+          <w:p>
+            <w:r>
+              <w:rPr>
+                <w:b/>
+                <w:sz w:val="18"/>
+              </w:rPr>
+              <w:t>Within +/-10%</w:t>
+            </w:r>
+          </w:p>
+        </w:tc>
+      </w:tr>
+      <w:tr>
+        <w:tc>
+          <w:tcPr>
+            <w:tcW w:type="dxa" w:w="1728"/>
+          </w:tcPr>
+          <w:p>
+            <w:r>
+              <w:rPr>
+                <w:sz w:val="18"/>
+              </w:rPr>
+              <w:t>KAERI non-uniform</w:t>
+            </w:r>
+          </w:p>
+        </w:tc>
+        <w:tc>
+          <w:tcPr>
+            <w:tcW w:type="dxa" w:w="1728"/>
+          </w:tcPr>
+          <w:p>
+            <w:r>
+              <w:rPr>
+                <w:sz w:val="18"/>
+              </w:rPr>
+              <w:t>0.797</w:t>
+            </w:r>
+          </w:p>
+        </w:tc>
+        <w:tc>
+          <w:tcPr>
+            <w:tcW w:type="dxa" w:w="1728"/>
+          </w:tcPr>
+          <w:p>
+            <w:r>
+              <w:rPr>
+                <w:sz w:val="18"/>
+              </w:rPr>
+              <w:t>0.841</w:t>
+            </w:r>
+          </w:p>
+        </w:tc>
+        <w:tc>
+          <w:tcPr>
+            <w:tcW w:type="dxa" w:w="1728"/>
+          </w:tcPr>
+          <w:p>
+            <w:r>
+              <w:rPr>
+                <w:sz w:val="18"/>
+              </w:rPr>
+              <w:t>0.970</w:t>
+            </w:r>
+          </w:p>
+        </w:tc>
+        <w:tc>
+          <w:tcPr>
+            <w:tcW w:type="dxa" w:w="1728"/>
+          </w:tcPr>
+          <w:p>
+            <w:r>
+              <w:rPr>
+                <w:sz w:val="18"/>
+              </w:rPr>
+              <w:t>47.5%</w:t>
+            </w:r>
+          </w:p>
+        </w:tc>
+      </w:tr>
+      <w:tr>
+        <w:tc>
+          <w:tcPr>
+            <w:tcW w:type="dxa" w:w="1728"/>
+          </w:tcPr>
+          <w:p>
+            <w:r>
+              <w:rPr>
+                <w:sz w:val="18"/>
+              </w:rPr>
+              <w:t>NRC</w:t>
+            </w:r>
+          </w:p>
+        </w:tc>
+        <w:tc>
+          <w:tcPr>
+            <w:tcW w:type="dxa" w:w="1728"/>
+          </w:tcPr>
+          <w:p>
+            <w:r>
+              <w:rPr>
+                <w:sz w:val="18"/>
+              </w:rPr>
+              <w:t>0.926</w:t>
+            </w:r>
+          </w:p>
+        </w:tc>
+        <w:tc>
+          <w:tcPr>
+            <w:tcW w:type="dxa" w:w="1728"/>
+          </w:tcPr>
+          <w:p>
+            <w:r>
+              <w:rPr>
+                <w:sz w:val="18"/>
+              </w:rPr>
+              <w:t>0.242</w:t>
+            </w:r>
+          </w:p>
+        </w:tc>
+        <w:tc>
+          <w:tcPr>
+            <w:tcW w:type="dxa" w:w="1728"/>
+          </w:tcPr>
+          <w:p>
+            <w:r>
+              <w:rPr>
+                <w:sz w:val="18"/>
+              </w:rPr>
+              <w:t>0.944</w:t>
+            </w:r>
+          </w:p>
+        </w:tc>
+        <w:tc>
+          <w:tcPr>
+            <w:tcW w:type="dxa" w:w="1728"/>
+          </w:tcPr>
+          <w:p>
+            <w:r>
+              <w:rPr>
+                <w:sz w:val="18"/>
+              </w:rPr>
+              <w:t>47.0%</w:t>
+            </w:r>
+          </w:p>
+        </w:tc>
+      </w:tr>
+      <w:tr>
+        <w:tc>
+          <w:tcPr>
+            <w:tcW w:type="dxa" w:w="1728"/>
+          </w:tcPr>
+          <w:p>
+            <w:r>
+              <w:rPr>
+                <w:sz w:val="18"/>
+              </w:rPr>
+              <w:t>Hardik straight tube</w:t>
+            </w:r>
+          </w:p>
+        </w:tc>
+        <w:tc>
+          <w:tcPr>
+            <w:tcW w:type="dxa" w:w="1728"/>
+          </w:tcPr>
+          <w:p>
+            <w:r>
+              <w:rPr>
+                <w:sz w:val="18"/>
+              </w:rPr>
+              <w:t>0.636</w:t>
+            </w:r>
+          </w:p>
+        </w:tc>
+        <w:tc>
+          <w:tcPr>
+            <w:tcW w:type="dxa" w:w="1728"/>
+          </w:tcPr>
+          <w:p>
+            <w:r>
+              <w:rPr>
+                <w:sz w:val="18"/>
+              </w:rPr>
+              <w:t>-868.6</w:t>
+            </w:r>
+          </w:p>
+        </w:tc>
+        <w:tc>
+          <w:tcPr>
+            <w:tcW w:type="dxa" w:w="1728"/>
+          </w:tcPr>
+          <w:p>
+            <w:r>
+              <w:rPr>
+                <w:sz w:val="18"/>
+              </w:rPr>
+              <w:t>0.793</w:t>
+            </w:r>
+          </w:p>
+        </w:tc>
+        <w:tc>
+          <w:tcPr>
+            <w:tcW w:type="dxa" w:w="1728"/>
+          </w:tcPr>
+          <w:p>
+            <w:r>
+              <w:rPr>
+                <w:sz w:val="18"/>
+              </w:rPr>
+              <w:t>33.8%</w:t>
+            </w:r>
+          </w:p>
+        </w:tc>
+      </w:tr>
+      <w:tr>
+        <w:tc>
+          <w:tcPr>
+            <w:tcW w:type="dxa" w:w="1728"/>
+          </w:tcPr>
+          <w:p>
+            <w:r>
+              <w:rPr>
+                <w:sz w:val="18"/>
+              </w:rPr>
+              <w:t>KAERI uniform</w:t>
+            </w:r>
+          </w:p>
+        </w:tc>
+        <w:tc>
+          <w:tcPr>
+            <w:tcW w:type="dxa" w:w="1728"/>
+          </w:tcPr>
+          <w:p>
+            <w:r>
+              <w:rPr>
+                <w:sz w:val="18"/>
+              </w:rPr>
+              <w:t>0.620</w:t>
+            </w:r>
+          </w:p>
+        </w:tc>
+        <w:tc>
+          <w:tcPr>
+            <w:tcW w:type="dxa" w:w="1728"/>
+          </w:tcPr>
+          <w:p>
+            <w:r>
+              <w:rPr>
+                <w:sz w:val="18"/>
+              </w:rPr>
+              <w:t>0.852</w:t>
+            </w:r>
+          </w:p>
+        </w:tc>
+        <w:tc>
+          <w:tcPr>
+            <w:tcW w:type="dxa" w:w="1728"/>
+          </w:tcPr>
+          <w:p>
+            <w:r>
+              <w:rPr>
+                <w:sz w:val="18"/>
+              </w:rPr>
+              <w:t>0.735</w:t>
+            </w:r>
+          </w:p>
+        </w:tc>
+        <w:tc>
+          <w:tcPr>
+            <w:tcW w:type="dxa" w:w="1728"/>
+          </w:tcPr>
+          <w:p>
+            <w:r>
+              <w:rPr>
+                <w:sz w:val="18"/>
+              </w:rPr>
+              <w:t>58.9%</w:t>
+            </w:r>
+          </w:p>
+        </w:tc>
+      </w:tr>
+      <w:tr>
+        <w:tc>
+          <w:tcPr>
+            <w:tcW w:type="dxa" w:w="1728"/>
+          </w:tcPr>
+          <w:p>
+            <w:r>
+              <w:rPr>
+                <w:sz w:val="18"/>
+              </w:rPr>
+              <w:t>Hardik helical coil</w:t>
+            </w:r>
+          </w:p>
+        </w:tc>
+        <w:tc>
+          <w:tcPr>
+            <w:tcW w:type="dxa" w:w="1728"/>
+          </w:tcPr>
+          <w:p>
+            <w:r>
+              <w:rPr>
+                <w:sz w:val="18"/>
+              </w:rPr>
+              <w:t>-0.161</w:t>
+            </w:r>
+          </w:p>
+        </w:tc>
+        <w:tc>
+          <w:tcPr>
+            <w:tcW w:type="dxa" w:w="1728"/>
+          </w:tcPr>
+          <w:p>
+            <w:r>
+              <w:rPr>
+                <w:sz w:val="18"/>
+              </w:rPr>
+              <w:t>-1.214</w:t>
+            </w:r>
+          </w:p>
+        </w:tc>
+        <w:tc>
+          <w:tcPr>
+            <w:tcW w:type="dxa" w:w="1728"/>
+          </w:tcPr>
+          <w:p>
+            <w:r>
+              <w:rPr>
+                <w:sz w:val="18"/>
+              </w:rPr>
+              <w:t>0.687</w:t>
+            </w:r>
+          </w:p>
+        </w:tc>
+        <w:tc>
+          <w:tcPr>
+            <w:tcW w:type="dxa" w:w="1728"/>
+          </w:tcPr>
+          <w:p>
+            <w:r>
+              <w:rPr>
+                <w:sz w:val="18"/>
+              </w:rPr>
+              <w:t>29.7%</w:t>
+            </w:r>
+          </w:p>
+        </w:tc>
+      </w:tr>
+      <w:tr>
+        <w:tc>
+          <w:tcPr>
+            <w:tcW w:type="dxa" w:w="1728"/>
+          </w:tcPr>
+          <w:p>
+            <w:r>
+              <w:rPr>
+                <w:sz w:val="18"/>
+              </w:rPr>
+              <w:t>Helical R-123</w:t>
+            </w:r>
+          </w:p>
+        </w:tc>
+        <w:tc>
+          <w:tcPr>
+            <w:tcW w:type="dxa" w:w="1728"/>
+          </w:tcPr>
+          <w:p>
+            <w:r>
+              <w:rPr>
+                <w:sz w:val="18"/>
+              </w:rPr>
+              <w:t>0.051</w:t>
+            </w:r>
+          </w:p>
+        </w:tc>
+        <w:tc>
+          <w:tcPr>
+            <w:tcW w:type="dxa" w:w="1728"/>
+          </w:tcPr>
+          <w:p>
+            <w:r>
+              <w:rPr>
+                <w:sz w:val="18"/>
+              </w:rPr>
+              <w:t>-307.7</w:t>
+            </w:r>
+          </w:p>
+        </w:tc>
+        <w:tc>
+          <w:tcPr>
+            <w:tcW w:type="dxa" w:w="1728"/>
+          </w:tcPr>
+          <w:p>
+            <w:r>
+              <w:rPr>
+                <w:sz w:val="18"/>
+              </w:rPr>
+              <w:t>0.449</w:t>
+            </w:r>
+          </w:p>
+        </w:tc>
+        <w:tc>
+          <w:tcPr>
+            <w:tcW w:type="dxa" w:w="1728"/>
+          </w:tcPr>
+          <w:p>
+            <w:r>
+              <w:rPr>
+                <w:sz w:val="18"/>
+              </w:rPr>
+              <w:t>14.8%</w:t>
+            </w:r>
+          </w:p>
+        </w:tc>
+      </w:tr>
+      <w:tr>
+        <w:tc>
+          <w:tcPr>
+            <w:tcW w:type="dxa" w:w="1728"/>
+          </w:tcPr>
+          <w:p>
+            <w:r>
+              <w:rPr>
+                <w:sz w:val="18"/>
+              </w:rPr>
+              <w:t>Pioro R-134a</w:t>
+            </w:r>
+          </w:p>
+        </w:tc>
+        <w:tc>
+          <w:tcPr>
+            <w:tcW w:type="dxa" w:w="1728"/>
+          </w:tcPr>
+          <w:p>
+            <w:r>
+              <w:rPr>
+                <w:sz w:val="18"/>
+              </w:rPr>
+              <w:t>-0.097</w:t>
+            </w:r>
+          </w:p>
+        </w:tc>
+        <w:tc>
+          <w:tcPr>
+            <w:tcW w:type="dxa" w:w="1728"/>
+          </w:tcPr>
+          <w:p>
+            <w:r>
+              <w:rPr>
+                <w:sz w:val="18"/>
+              </w:rPr>
+              <w:t>-423.6</w:t>
+            </w:r>
+          </w:p>
+        </w:tc>
+        <w:tc>
+          <w:tcPr>
+            <w:tcW w:type="dxa" w:w="1728"/>
+          </w:tcPr>
+          <w:p>
+            <w:r>
+              <w:rPr>
+                <w:sz w:val="18"/>
+              </w:rPr>
+              <w:t>-0.065</w:t>
+            </w:r>
+          </w:p>
+        </w:tc>
+        <w:tc>
+          <w:tcPr>
+            <w:tcW w:type="dxa" w:w="1728"/>
+          </w:tcPr>
+          <w:p>
+            <w:r>
+              <w:rPr>
+                <w:sz w:val="18"/>
+              </w:rPr>
+              <w:t>16.0%</w:t>
+            </w:r>
+          </w:p>
+        </w:tc>
+      </w:tr>
+      <w:tr>
+        <w:tc>
+          <w:tcPr>
+            <w:tcW w:type="dxa" w:w="1728"/>
+          </w:tcPr>
+          <w:p>
+            <w:r>
+              <w:rPr>
+                <w:sz w:val="18"/>
+              </w:rPr>
+              <w:t>Zhao 2020</w:t>
+            </w:r>
+          </w:p>
+        </w:tc>
+        <w:tc>
+          <w:tcPr>
+            <w:tcW w:type="dxa" w:w="1728"/>
+          </w:tcPr>
+          <w:p>
+            <w:r>
+              <w:rPr>
+                <w:sz w:val="18"/>
+              </w:rPr>
+              <w:t>-0.437</w:t>
+            </w:r>
+          </w:p>
+        </w:tc>
+        <w:tc>
+          <w:tcPr>
+            <w:tcW w:type="dxa" w:w="1728"/>
+          </w:tcPr>
+          <w:p>
+            <w:r>
+              <w:rPr>
+                <w:sz w:val="18"/>
+              </w:rPr>
+              <w:t>-1.433</w:t>
+            </w:r>
+          </w:p>
+        </w:tc>
+        <w:tc>
+          <w:tcPr>
+            <w:tcW w:type="dxa" w:w="1728"/>
+          </w:tcPr>
+          <w:p>
+            <w:r>
+              <w:rPr>
+                <w:sz w:val="18"/>
+              </w:rPr>
+              <w:t>-0.429</w:t>
+            </w:r>
+          </w:p>
+        </w:tc>
+        <w:tc>
+          <w:tcPr>
+            <w:tcW w:type="dxa" w:w="1728"/>
+          </w:tcPr>
+          <w:p>
+            <w:r>
+              <w:rPr>
+                <w:sz w:val="18"/>
+              </w:rPr>
+              <w:t>7.7%</w:t>
+            </w:r>
+          </w:p>
+        </w:tc>
+      </w:tr>
+      <w:tr>
+        <w:tc>
+          <w:tcPr>
+            <w:tcW w:type="dxa" w:w="1728"/>
+          </w:tcPr>
+          <w:p>
+            <w:r>
+              <w:rPr>
+                <w:sz w:val="18"/>
+              </w:rPr>
+              <w:t>Median across all eight</w:t>
+            </w:r>
+          </w:p>
+        </w:tc>
+        <w:tc>
+          <w:tcPr>
+            <w:tcW w:type="dxa" w:w="1728"/>
+          </w:tcPr>
+          <w:p>
+            <w:r>
+              <w:rPr>
+                <w:sz w:val="18"/>
+              </w:rPr>
+              <w:t>+0.336</w:t>
+            </w:r>
+          </w:p>
+        </w:tc>
+        <w:tc>
+          <w:tcPr>
+            <w:tcW w:type="dxa" w:w="1728"/>
+          </w:tcPr>
+          <w:p>
+            <w:r>
+              <w:rPr>
+                <w:sz w:val="18"/>
+              </w:rPr>
+              <w:t>-1.323</w:t>
+            </w:r>
+          </w:p>
+        </w:tc>
+        <w:tc>
+          <w:tcPr>
+            <w:tcW w:type="dxa" w:w="1728"/>
+          </w:tcPr>
+          <w:p>
+            <w:r>
+              <w:rPr>
+                <w:sz w:val="18"/>
+              </w:rPr>
+              <w:t>+0.711</w:t>
+            </w:r>
+          </w:p>
+        </w:tc>
+        <w:tc>
+          <w:tcPr>
+            <w:tcW w:type="dxa" w:w="1728"/>
+          </w:tcPr>
+          <w:p>
+            <w:r>
+              <w:rPr>
+                <w:sz w:val="18"/>
+              </w:rPr>
+              <w:t>31.8%</w:t>
+            </w:r>
+          </w:p>
+        </w:tc>
+      </w:tr>
+    </w:tbl>
+    <w:p/>
+    <w:p>
+      <w:r>
+        <w:t>The headline result in Table 4 is not the median score by itself, it is the absence of catastrophe. An unanchored data-driven model reaches an R-squared of minus 868 on one unseen dataset, a result with no practical meaning beyond signaling total failure, while the proposed hybrid's worst case across all eight unseen datasets is minus 0.429. A model that is occasionally mediocre but never that catastrophic is a fundamentally different, and for a safety-relevant quantity like CHF, considerably more useful thing than a model that is usually excellent but occasionally worthless.</w:t>
+      </w:r>
+    </w:p>
+    <w:p>
+      <w:r>
+        <w:t>Other models and configurations explored. The five models above are the headline comparison, but they are far from everything this project tried. Across several rounds of hyperparameter tuning and architecture search, involving roughly thirty configurations in the earliest phase alone and a further 720-configuration search specifically for the physics-informed network, a considerable number of ideas were tested and set aside once they failed to improve genuinely held-out accuracy. Table 5 summarizes the ones most worth recording, precisely because a negative result, tested honestly, is still useful evidence about what does not work for this problem.</w:t>
+      </w:r>
+    </w:p>
+    <w:p>
+      <w:r>
+        <w:rPr>
+          <w:i/>
+          <w:sz w:val="18"/>
+        </w:rPr>
+        <w:t>Table 5. Additional models, hyperparameter variations, and architectural ideas tested over the course of this project, beyond the five headline models above.</w:t>
+      </w:r>
+    </w:p>
+    <w:tbl>
+      <w:tblPr>
+        <w:tblStyle w:val="LightGrid-Accent1"/>
+        <w:tblW w:type="auto" w:w="0"/>
+        <w:tblLook w:firstColumn="1" w:firstRow="1" w:lastColumn="0" w:lastRow="0" w:noHBand="0" w:noVBand="1" w:val="04A0"/>
+      </w:tblPr>
+      <w:tblGrid>
+        <w:gridCol w:w="2880"/>
+        <w:gridCol w:w="2880"/>
+        <w:gridCol w:w="2880"/>
+      </w:tblGrid>
+      <w:tr>
+        <w:tc>
+          <w:tcPr>
+            <w:tcW w:type="dxa" w:w="2880"/>
+          </w:tcPr>
+          <w:p>
+            <w:r>
+              <w:rPr>
+                <w:b/>
+                <w:sz w:val="18"/>
+              </w:rPr>
+              <w:t>Technique tried</w:t>
+            </w:r>
+          </w:p>
+        </w:tc>
+        <w:tc>
+          <w:tcPr>
+            <w:tcW w:type="dxa" w:w="2880"/>
+          </w:tcPr>
+          <w:p>
+            <w:r>
+              <w:rPr>
+                <w:b/>
+                <w:sz w:val="18"/>
+              </w:rPr>
+              <w:t>What it was meant to test</w:t>
+            </w:r>
+          </w:p>
+        </w:tc>
+        <w:tc>
+          <w:tcPr>
+            <w:tcW w:type="dxa" w:w="2880"/>
+          </w:tcPr>
+          <w:p>
+            <w:r>
+              <w:rPr>
+                <w:b/>
+                <w:sz w:val="18"/>
+              </w:rPr>
+              <w:t>Outcome</w:t>
+            </w:r>
+          </w:p>
+        </w:tc>
+      </w:tr>
+      <w:tr>
+        <w:tc>
+          <w:tcPr>
+            <w:tcW w:type="dxa" w:w="2880"/>
+          </w:tcPr>
+          <w:p>
+            <w:r>
+              <w:rPr>
+                <w:sz w:val="18"/>
+              </w:rPr>
+              <w:t>Linear / Ridge regression</w:t>
+            </w:r>
+          </w:p>
+        </w:tc>
+        <w:tc>
+          <w:tcPr>
+            <w:tcW w:type="dxa" w:w="2880"/>
+          </w:tcPr>
+          <w:p>
+            <w:r>
+              <w:rPr>
+                <w:sz w:val="18"/>
+              </w:rPr>
+              <w:t>A simple baseline, expected to be outperformed</w:t>
+            </w:r>
+          </w:p>
+        </w:tc>
+        <w:tc>
+          <w:tcPr>
+            <w:tcW w:type="dxa" w:w="2880"/>
+          </w:tcPr>
+          <w:p>
+            <w:r>
+              <w:rPr>
+                <w:sz w:val="18"/>
+              </w:rPr>
+              <w:t>In one leave-one-publication-out test, plain linear regression beat gradient boosting, XGBoost, and Gaussian process regression; kept as a standing baseline</w:t>
+            </w:r>
+          </w:p>
+        </w:tc>
+      </w:tr>
+      <w:tr>
+        <w:tc>
+          <w:tcPr>
+            <w:tcW w:type="dxa" w:w="2880"/>
+          </w:tcPr>
+          <w:p>
+            <w:r>
+              <w:rPr>
+                <w:sz w:val="18"/>
+              </w:rPr>
+              <w:t>k-Nearest Neighbors (k=3, distance-weighted)</w:t>
+            </w:r>
+          </w:p>
+        </w:tc>
+        <w:tc>
+          <w:tcPr>
+            <w:tcW w:type="dxa" w:w="2880"/>
+          </w:tcPr>
+          <w:p>
+            <w:r>
+              <w:rPr>
+                <w:sz w:val="18"/>
+              </w:rPr>
+              <w:t>A grid-memorization diagnostic, not a serious final model</w:t>
+            </w:r>
+          </w:p>
+        </w:tc>
+        <w:tc>
+          <w:tcPr>
+            <w:tcW w:type="dxa" w:w="2880"/>
+          </w:tcPr>
+          <w:p>
+            <w:r>
+              <w:rPr>
+                <w:sz w:val="18"/>
+              </w:rPr>
+              <w:t>Useful for showing how much of a dataset's apparent accuracy comes from simply having a close neighbor nearby</w:t>
+            </w:r>
+          </w:p>
+        </w:tc>
+      </w:tr>
+      <w:tr>
+        <w:tc>
+          <w:tcPr>
+            <w:tcW w:type="dxa" w:w="2880"/>
+          </w:tcPr>
+          <w:p>
+            <w:r>
+              <w:rPr>
+                <w:sz w:val="18"/>
+              </w:rPr>
+              <w:t>Degree-2 / degree-4 polynomial ridge</w:t>
+            </w:r>
+          </w:p>
+        </w:tc>
+        <w:tc>
+          <w:tcPr>
+            <w:tcW w:type="dxa" w:w="2880"/>
+          </w:tcPr>
+          <w:p>
+            <w:r>
+              <w:rPr>
+                <w:sz w:val="18"/>
+              </w:rPr>
+              <w:t>A simple nonlinear baseline on standardized inputs</w:t>
+            </w:r>
+          </w:p>
+        </w:tc>
+        <w:tc>
+          <w:tcPr>
+            <w:tcW w:type="dxa" w:w="2880"/>
+          </w:tcPr>
+          <w:p>
+            <w:r>
+              <w:rPr>
+                <w:sz w:val="18"/>
+              </w:rPr>
+              <w:t>Reasonable inside the training range, error grows sharply outside it once expanded to higher-degree terms</w:t>
+            </w:r>
+          </w:p>
+        </w:tc>
+      </w:tr>
+      <w:tr>
+        <w:tc>
+          <w:tcPr>
+            <w:tcW w:type="dxa" w:w="2880"/>
+          </w:tcPr>
+          <w:p>
+            <w:r>
+              <w:rPr>
+                <w:sz w:val="18"/>
+              </w:rPr>
+              <w:t>Stacked ensemble of multiple model types</w:t>
+            </w:r>
+          </w:p>
+        </w:tc>
+        <w:tc>
+          <w:tcPr>
+            <w:tcW w:type="dxa" w:w="2880"/>
+          </w:tcPr>
+          <w:p>
+            <w:r>
+              <w:rPr>
+                <w:sz w:val="18"/>
+              </w:rPr>
+              <w:t>Whether combining models improves robustness</w:t>
+            </w:r>
+          </w:p>
+        </w:tc>
+        <w:tc>
+          <w:tcPr>
+            <w:tcW w:type="dxa" w:w="2880"/>
+          </w:tcPr>
+          <w:p>
+            <w:r>
+              <w:rPr>
+                <w:sz w:val="18"/>
+              </w:rPr>
+              <w:t>Scored an R-squared of 0.459 against 0.945 for a single tree model under honest, source-grouped evaluation; the ensemble's own weights overfit to the training sources</w:t>
+            </w:r>
+          </w:p>
+        </w:tc>
+      </w:tr>
+      <w:tr>
+        <w:tc>
+          <w:tcPr>
+            <w:tcW w:type="dxa" w:w="2880"/>
+          </w:tcPr>
+          <w:p>
+            <w:r>
+              <w:rPr>
+                <w:sz w:val="18"/>
+              </w:rPr>
+              <w:t>Physics-informed neural network (PINN)</w:t>
+            </w:r>
+          </w:p>
+        </w:tc>
+        <w:tc>
+          <w:tcPr>
+            <w:tcW w:type="dxa" w:w="2880"/>
+          </w:tcPr>
+          <w:p>
+            <w:r>
+              <w:rPr>
+                <w:sz w:val="18"/>
+              </w:rPr>
+              <w:t>Whether enforcing physical penalties during training improves generalization</w:t>
+            </w:r>
+          </w:p>
+        </w:tc>
+        <w:tc>
+          <w:tcPr>
+            <w:tcW w:type="dxa" w:w="2880"/>
+          </w:tcPr>
+          <w:p>
+            <w:r>
+              <w:rPr>
+                <w:sz w:val="18"/>
+              </w:rPr>
+              <w:t>Apparent gains traced to target reparameterization, not the physics penalty, which was inactive; catastrophic instability under distribution shift (see Table 2); not carried forward as a standalone model</w:t>
+            </w:r>
+          </w:p>
+        </w:tc>
+      </w:tr>
+      <w:tr>
+        <w:tc>
+          <w:tcPr>
+            <w:tcW w:type="dxa" w:w="2880"/>
+          </w:tcPr>
+          <w:p>
+            <w:r>
+              <w:rPr>
+                <w:sz w:val="18"/>
+              </w:rPr>
+              <w:t>Deep ensembles for uncertainty</w:t>
+            </w:r>
+          </w:p>
+        </w:tc>
+        <w:tc>
+          <w:tcPr>
+            <w:tcW w:type="dxa" w:w="2880"/>
+          </w:tcPr>
+          <w:p>
+            <w:r>
+              <w:rPr>
+                <w:sz w:val="18"/>
+              </w:rPr>
+              <w:t>Calibrated confidence intervals from ensemble spread</w:t>
+            </w:r>
+          </w:p>
+        </w:tc>
+        <w:tc>
+          <w:tcPr>
+            <w:tcW w:type="dxa" w:w="2880"/>
+          </w:tcPr>
+          <w:p>
+            <w:r>
+              <w:rPr>
+                <w:sz w:val="18"/>
+              </w:rPr>
+              <w:t>95%-nominal intervals contained the true value only 9 to 22% of the time on unseen data; replaced with conformal prediction</w:t>
+            </w:r>
+          </w:p>
+        </w:tc>
+      </w:tr>
+      <w:tr>
+        <w:tc>
+          <w:tcPr>
+            <w:tcW w:type="dxa" w:w="2880"/>
+          </w:tcPr>
+          <w:p>
+            <w:r>
+              <w:rPr>
+                <w:sz w:val="18"/>
+              </w:rPr>
+              <w:t>Pretraining and fine-tuning (MLP and Transformer)</w:t>
+            </w:r>
+          </w:p>
+        </w:tc>
+        <w:tc>
+          <w:tcPr>
+            <w:tcW w:type="dxa" w:w="2880"/>
+          </w:tcPr>
+          <w:p>
+            <w:r>
+              <w:rPr>
+                <w:sz w:val="18"/>
+              </w:rPr>
+              <w:t>Transfer learning as a head start for real-data fine-tuning</w:t>
+            </w:r>
+          </w:p>
+        </w:tc>
+        <w:tc>
+          <w:tcPr>
+            <w:tcW w:type="dxa" w:w="2880"/>
+          </w:tcPr>
+          <w:p>
+            <w:r>
+              <w:rPr>
+                <w:sz w:val="18"/>
+              </w:rPr>
+              <w:t>Improved extrapolation R-squared over training from scratch, but pooling all fine-tuning domains together underperformed separate per-domain fine-tuning in 8 of 10 comparisons</w:t>
+            </w:r>
+          </w:p>
+        </w:tc>
+      </w:tr>
+      <w:tr>
+        <w:tc>
+          <w:tcPr>
+            <w:tcW w:type="dxa" w:w="2880"/>
+          </w:tcPr>
+          <w:p>
+            <w:r>
+              <w:rPr>
+                <w:sz w:val="18"/>
+              </w:rPr>
+              <w:t>LoRA (low-rank adapters)</w:t>
+            </w:r>
+          </w:p>
+        </w:tc>
+        <w:tc>
+          <w:tcPr>
+            <w:tcW w:type="dxa" w:w="2880"/>
+          </w:tcPr>
+          <w:p>
+            <w:r>
+              <w:rPr>
+                <w:sz w:val="18"/>
+              </w:rPr>
+              <w:t>Cheaper fine-tuning with fewer trainable parameters</w:t>
+            </w:r>
+          </w:p>
+        </w:tc>
+        <w:tc>
+          <w:tcPr>
+            <w:tcW w:type="dxa" w:w="2880"/>
+          </w:tcPr>
+          <w:p>
+            <w:r>
+              <w:rPr>
+                <w:sz w:val="18"/>
+              </w:rPr>
+              <w:t>Reached an R-squared of 0.685 using only 8.8% of parameters trainable, close to full fine-tuning's 0.696</w:t>
+            </w:r>
+          </w:p>
+        </w:tc>
+      </w:tr>
+      <w:tr>
+        <w:tc>
+          <w:tcPr>
+            <w:tcW w:type="dxa" w:w="2880"/>
+          </w:tcPr>
+          <w:p>
+            <w:r>
+              <w:rPr>
+                <w:sz w:val="18"/>
+              </w:rPr>
+              <w:t>Mixture-of-Experts routing</w:t>
+            </w:r>
+          </w:p>
+        </w:tc>
+        <w:tc>
+          <w:tcPr>
+            <w:tcW w:type="dxa" w:w="2880"/>
+          </w:tcPr>
+          <w:p>
+            <w:r>
+              <w:rPr>
+                <w:sz w:val="18"/>
+              </w:rPr>
+              <w:t>Route pool-boiling and flow-boiling inputs to specialized sub-models</w:t>
+            </w:r>
+          </w:p>
+        </w:tc>
+        <w:tc>
+          <w:tcPr>
+            <w:tcW w:type="dxa" w:w="2880"/>
+          </w:tcPr>
+          <w:p>
+            <w:r>
+              <w:rPr>
+                <w:sz w:val="18"/>
+              </w:rPr>
+              <w:t>The routing gate did not learn the distinction reliably; abandoned in favor of a single pooled correction (Section 3.3)</w:t>
+            </w:r>
+          </w:p>
+        </w:tc>
+      </w:tr>
+      <w:tr>
+        <w:tc>
+          <w:tcPr>
+            <w:tcW w:type="dxa" w:w="2880"/>
+          </w:tcPr>
+          <w:p>
+            <w:r>
+              <w:rPr>
+                <w:sz w:val="18"/>
+              </w:rPr>
+              <w:t>Inverse dataset-size weighting</w:t>
+            </w:r>
+          </w:p>
+        </w:tc>
+        <w:tc>
+          <w:tcPr>
+            <w:tcW w:type="dxa" w:w="2880"/>
+          </w:tcPr>
+          <w:p>
+            <w:r>
+              <w:rPr>
+                <w:sz w:val="18"/>
+              </w:rPr>
+              <w:t>Reduce the influence of one very large source on training</w:t>
+            </w:r>
+          </w:p>
+        </w:tc>
+        <w:tc>
+          <w:tcPr>
+            <w:tcW w:type="dxa" w:w="2880"/>
+          </w:tcPr>
+          <w:p>
+            <w:r>
+              <w:rPr>
+                <w:sz w:val="18"/>
+              </w:rPr>
+              <w:t>Median R-squared fell from 0.777 to 0.767; rejected</w:t>
+            </w:r>
+          </w:p>
+        </w:tc>
+      </w:tr>
+      <w:tr>
+        <w:tc>
+          <w:tcPr>
+            <w:tcW w:type="dxa" w:w="2880"/>
+          </w:tcPr>
+          <w:p>
+            <w:r>
+              <w:rPr>
+                <w:sz w:val="18"/>
+              </w:rPr>
+              <w:t>Absolute-error loss instead of squared error</w:t>
+            </w:r>
+          </w:p>
+        </w:tc>
+        <w:tc>
+          <w:tcPr>
+            <w:tcW w:type="dxa" w:w="2880"/>
+          </w:tcPr>
+          <w:p>
+            <w:r>
+              <w:rPr>
+                <w:sz w:val="18"/>
+              </w:rPr>
+              <w:t>Match the loss function to the reported accuracy metric</w:t>
+            </w:r>
+          </w:p>
+        </w:tc>
+        <w:tc>
+          <w:tcPr>
+            <w:tcW w:type="dxa" w:w="2880"/>
+          </w:tcPr>
+          <w:p>
+            <w:r>
+              <w:rPr>
+                <w:sz w:val="18"/>
+              </w:rPr>
+              <w:t>Median R-squared fell to 0.700; rejected</w:t>
+            </w:r>
+          </w:p>
+        </w:tc>
+      </w:tr>
+      <w:tr>
+        <w:tc>
+          <w:tcPr>
+            <w:tcW w:type="dxa" w:w="2880"/>
+          </w:tcPr>
+          <w:p>
+            <w:r>
+              <w:rPr>
+                <w:sz w:val="18"/>
+              </w:rPr>
+              <w:t>Correlation stacking (Biasi / LUT as extra features)</w:t>
+            </w:r>
+          </w:p>
+        </w:tc>
+        <w:tc>
+          <w:tcPr>
+            <w:tcW w:type="dxa" w:w="2880"/>
+          </w:tcPr>
+          <w:p>
+            <w:r>
+              <w:rPr>
+                <w:sz w:val="18"/>
+              </w:rPr>
+              <w:t>Give the model a physics correlation's output as an input</w:t>
+            </w:r>
+          </w:p>
+        </w:tc>
+        <w:tc>
+          <w:tcPr>
+            <w:tcW w:type="dxa" w:w="2880"/>
+          </w:tcPr>
+          <w:p>
+            <w:r>
+              <w:rPr>
+                <w:sz w:val="18"/>
+              </w:rPr>
+              <w:t>Median R-squared fell to 0.727; rejected</w:t>
+            </w:r>
+          </w:p>
+        </w:tc>
+      </w:tr>
+      <w:tr>
+        <w:tc>
+          <w:tcPr>
+            <w:tcW w:type="dxa" w:w="2880"/>
+          </w:tcPr>
+          <w:p>
+            <w:r>
+              <w:rPr>
+                <w:sz w:val="18"/>
+              </w:rPr>
+              <w:t>Missing-value indicator column</w:t>
+            </w:r>
+          </w:p>
+        </w:tc>
+        <w:tc>
+          <w:tcPr>
+            <w:tcW w:type="dxa" w:w="2880"/>
+          </w:tcPr>
+          <w:p>
+            <w:r>
+              <w:rPr>
+                <w:sz w:val="18"/>
+              </w:rPr>
+              <w:t>Flag rows with incomplete data explicitly</w:t>
+            </w:r>
+          </w:p>
+        </w:tc>
+        <w:tc>
+          <w:tcPr>
+            <w:tcW w:type="dxa" w:w="2880"/>
+          </w:tcPr>
+          <w:p>
+            <w:r>
+              <w:rPr>
+                <w:sz w:val="18"/>
+              </w:rPr>
+              <w:t>Made results worse (0.660 vs 0.727); the indicator effectively leaked fluid identity, since it fires only on non-water rows</w:t>
+            </w:r>
+          </w:p>
+        </w:tc>
+      </w:tr>
+      <w:tr>
+        <w:tc>
+          <w:tcPr>
+            <w:tcW w:type="dxa" w:w="2880"/>
+          </w:tcPr>
+          <w:p>
+            <w:r>
+              <w:rPr>
+                <w:sz w:val="18"/>
+              </w:rPr>
+              <w:t>Weber number on diameter / boiling-number target</w:t>
+            </w:r>
+          </w:p>
+        </w:tc>
+        <w:tc>
+          <w:tcPr>
+            <w:tcW w:type="dxa" w:w="2880"/>
+          </w:tcPr>
+          <w:p>
+            <w:r>
+              <w:rPr>
+                <w:sz w:val="18"/>
+              </w:rPr>
+              <w:t>Reformulate inputs or target in the correlation literature's native dimensionless form</w:t>
+            </w:r>
+          </w:p>
+        </w:tc>
+        <w:tc>
+          <w:tcPr>
+            <w:tcW w:type="dxa" w:w="2880"/>
+          </w:tcPr>
+          <w:p>
+            <w:r>
+              <w:rPr>
+                <w:sz w:val="18"/>
+              </w:rPr>
+              <w:t>Median R-squared 0.731 and 0.703 respectively; both rejected in favor of the simpler dimensionless formulation in Section 3.3</w:t>
+            </w:r>
+          </w:p>
+        </w:tc>
+      </w:tr>
+      <w:tr>
+        <w:tc>
+          <w:tcPr>
+            <w:tcW w:type="dxa" w:w="2880"/>
+          </w:tcPr>
+          <w:p>
+            <w:r>
+              <w:rPr>
+                <w:sz w:val="18"/>
+              </w:rPr>
+              <w:t>Backbone ensembling across physics correlations</w:t>
+            </w:r>
+          </w:p>
+        </w:tc>
+        <w:tc>
+          <w:tcPr>
+            <w:tcW w:type="dxa" w:w="2880"/>
+          </w:tcPr>
+          <w:p>
+            <w:r>
+              <w:rPr>
+                <w:sz w:val="18"/>
+              </w:rPr>
+              <w:t>Avoid betting on a single physics correlation</w:t>
+            </w:r>
+          </w:p>
+        </w:tc>
+        <w:tc>
+          <w:tcPr>
+            <w:tcW w:type="dxa" w:w="2880"/>
+          </w:tcPr>
+          <w:p>
+            <w:r>
+              <w:rPr>
+                <w:sz w:val="18"/>
+              </w:rPr>
+              <w:t>Helped one dataset, hurt another; no single global choice served both, so a single best-correlation rule was kept instead</w:t>
+            </w:r>
+          </w:p>
+        </w:tc>
+      </w:tr>
+    </w:tbl>
+    <w:p/>
+    <w:p>
+      <w:r>
+        <w:t>The one modification out of eleven tested in this particular round that was actually adopted was not a modeling idea at all: it was correcting a fabricated placeholder value in one dataset's diameter column, already described in Section 1.8. Across this entire project, that pattern held up more often than not: fixing what the data actually said tended to matter more than which model, loss function, or architecture was used to fit it.</w:t>
+      </w:r>
+    </w:p>
+    <w:p>
+      <w:pPr>
+        <w:pStyle w:val="Heading2"/>
+      </w:pPr>
+      <w:r>
+        <w:t>3.3 Proposed Model Hierarchy</w:t>
+      </w:r>
+    </w:p>
+    <w:p>
+      <w:r>
+        <w:t>The model proposed in this paper, referred to as Model 5 above, is not a single network but a hierarchy of five layers, each one added specifically because an earlier, simpler design failed in a documented way somewhere in this paper. Table 6 lists the five layers in order.</w:t>
+      </w:r>
+    </w:p>
+    <w:p>
+      <w:r>
+        <w:rPr>
+          <w:i/>
+          <w:sz w:val="18"/>
+        </w:rPr>
+        <w:t>Table 6. The proposed model's layer hierarchy, from raw inputs to a final prediction with an uncertainty interval.</w:t>
+      </w:r>
+    </w:p>
+    <w:tbl>
+      <w:tblPr>
+        <w:tblStyle w:val="LightGrid-Accent1"/>
+        <w:tblW w:type="auto" w:w="0"/>
+        <w:tblLook w:firstColumn="1" w:firstRow="1" w:lastColumn="0" w:lastRow="0" w:noHBand="0" w:noVBand="1" w:val="04A0"/>
+      </w:tblPr>
+      <w:tblGrid>
+        <w:gridCol w:w="2880"/>
+        <w:gridCol w:w="2880"/>
+        <w:gridCol w:w="2880"/>
+      </w:tblGrid>
+      <w:tr>
+        <w:tc>
+          <w:tcPr>
+            <w:tcW w:type="dxa" w:w="2880"/>
+          </w:tcPr>
+          <w:p>
+            <w:r>
+              <w:rPr>
+                <w:b/>
+                <w:sz w:val="18"/>
+              </w:rPr>
+              <w:t>Layer</w:t>
+            </w:r>
+          </w:p>
+        </w:tc>
+        <w:tc>
+          <w:tcPr>
+            <w:tcW w:type="dxa" w:w="2880"/>
+          </w:tcPr>
+          <w:p>
+            <w:r>
+              <w:rPr>
+                <w:b/>
+                <w:sz w:val="18"/>
+              </w:rPr>
+              <w:t>Component</w:t>
+            </w:r>
+          </w:p>
+        </w:tc>
+        <w:tc>
+          <w:tcPr>
+            <w:tcW w:type="dxa" w:w="2880"/>
+          </w:tcPr>
+          <w:p>
+            <w:r>
+              <w:rPr>
+                <w:b/>
+                <w:sz w:val="18"/>
+              </w:rPr>
+              <w:t>Purpose</w:t>
+            </w:r>
+          </w:p>
+        </w:tc>
+      </w:tr>
+      <w:tr>
+        <w:tc>
+          <w:tcPr>
+            <w:tcW w:type="dxa" w:w="2880"/>
+          </w:tcPr>
+          <w:p>
+            <w:r>
+              <w:rPr>
+                <w:sz w:val="18"/>
+              </w:rPr>
+              <w:t>Layer 0</w:t>
+            </w:r>
+          </w:p>
+        </w:tc>
+        <w:tc>
+          <w:tcPr>
+            <w:tcW w:type="dxa" w:w="2880"/>
+          </w:tcPr>
+          <w:p>
+            <w:r>
+              <w:rPr>
+                <w:sz w:val="18"/>
+              </w:rPr>
+              <w:t>Fluid properties and dimensionless groups</w:t>
+            </w:r>
+          </w:p>
+        </w:tc>
+        <w:tc>
+          <w:tcPr>
+            <w:tcW w:type="dxa" w:w="2880"/>
+          </w:tcPr>
+          <w:p>
+            <w:r>
+              <w:rPr>
+                <w:sz w:val="18"/>
+              </w:rPr>
+              <w:t>Converts fluid name and pressure into density, surface tension, and latent heat, then collapses the inputs into a small set of dimensionless numbers (inverse Weber number, density ratio, length-to-diameter ratio, subcooling ratio, reduced pressure), so the model never sees a raw fluid label</w:t>
+            </w:r>
+          </w:p>
+        </w:tc>
+      </w:tr>
+      <w:tr>
+        <w:tc>
+          <w:tcPr>
+            <w:tcW w:type="dxa" w:w="2880"/>
+          </w:tcPr>
+          <w:p>
+            <w:r>
+              <w:rPr>
+                <w:sz w:val="18"/>
+              </w:rPr>
+              <w:t>Layer 1</w:t>
+            </w:r>
+          </w:p>
+        </w:tc>
+        <w:tc>
+          <w:tcPr>
+            <w:tcW w:type="dxa" w:w="2880"/>
+          </w:tcPr>
+          <w:p>
+            <w:r>
+              <w:rPr>
+                <w:sz w:val="18"/>
+              </w:rPr>
+              <w:t>Physics backbone (zero fitted parameters)</w:t>
+            </w:r>
+          </w:p>
+        </w:tc>
+        <w:tc>
+          <w:tcPr>
+            <w:tcW w:type="dxa" w:w="2880"/>
+          </w:tcPr>
+          <w:p>
+            <w:r>
+              <w:rPr>
+                <w:sz w:val="18"/>
+              </w:rPr>
+              <w:t>An empirical correlation such as Katto-Ohno, Biasi, or the 2006 look-up table, selected automatically by whichever has the lowest error on the training rows only; this is the floor that prevents catastrophic failure</w:t>
+            </w:r>
+          </w:p>
+        </w:tc>
+      </w:tr>
+      <w:tr>
+        <w:tc>
+          <w:tcPr>
+            <w:tcW w:type="dxa" w:w="2880"/>
+          </w:tcPr>
+          <w:p>
+            <w:r>
+              <w:rPr>
+                <w:sz w:val="18"/>
+              </w:rPr>
+              <w:t>Layer 2</w:t>
+            </w:r>
+          </w:p>
+        </w:tc>
+        <w:tc>
+          <w:tcPr>
+            <w:tcW w:type="dxa" w:w="2880"/>
+          </w:tcPr>
+          <w:p>
+            <w:r>
+              <w:rPr>
+                <w:sz w:val="18"/>
+              </w:rPr>
+              <w:t>Pooled learned correction</w:t>
+            </w:r>
+          </w:p>
+        </w:tc>
+        <w:tc>
+          <w:tcPr>
+            <w:tcW w:type="dxa" w:w="2880"/>
+          </w:tcPr>
+          <w:p>
+            <w:r>
+              <w:rPr>
+                <w:sz w:val="18"/>
+              </w:rPr>
+              <w:t>A single tree-based model predicting the logarithm of the ratio between measured CHF and the Layer 1 backbone prediction, trained once on all sources pooled together rather than one model per dataset</w:t>
+            </w:r>
+          </w:p>
+        </w:tc>
+      </w:tr>
+      <w:tr>
+        <w:tc>
+          <w:tcPr>
+            <w:tcW w:type="dxa" w:w="2880"/>
+          </w:tcPr>
+          <w:p>
+            <w:r>
+              <w:rPr>
+                <w:sz w:val="18"/>
+              </w:rPr>
+              <w:t>Layer 3</w:t>
+            </w:r>
+          </w:p>
+        </w:tc>
+        <w:tc>
+          <w:tcPr>
+            <w:tcW w:type="dxa" w:w="2880"/>
+          </w:tcPr>
+          <w:p>
+            <w:r>
+              <w:rPr>
+                <w:sz w:val="18"/>
+              </w:rPr>
+              <w:t>Trust-scaled correction limit</w:t>
+            </w:r>
+          </w:p>
+        </w:tc>
+        <w:tc>
+          <w:tcPr>
+            <w:tcW w:type="dxa" w:w="2880"/>
+          </w:tcPr>
+          <w:p>
+            <w:r>
+              <w:rPr>
+                <w:sz w:val="18"/>
+              </w:rPr>
+              <w:t>Scales how far the Layer 2 correction is allowed to move the Layer 1 prediction: full trust allows up to a ten-fold correction, low trust clips the correction to one and a half times, so an unfamiliar input decays gracefully back toward the physics baseline rather than the learned correction running unchecked</w:t>
+            </w:r>
+          </w:p>
+        </w:tc>
+      </w:tr>
+      <w:tr>
+        <w:tc>
+          <w:tcPr>
+            <w:tcW w:type="dxa" w:w="2880"/>
+          </w:tcPr>
+          <w:p>
+            <w:r>
+              <w:rPr>
+                <w:sz w:val="18"/>
+              </w:rPr>
+              <w:t>Layer 4</w:t>
+            </w:r>
+          </w:p>
+        </w:tc>
+        <w:tc>
+          <w:tcPr>
+            <w:tcW w:type="dxa" w:w="2880"/>
+          </w:tcPr>
+          <w:p>
+            <w:r>
+              <w:rPr>
+                <w:sz w:val="18"/>
+              </w:rPr>
+              <w:t>Conformal prediction interval and regime label</w:t>
+            </w:r>
+          </w:p>
+        </w:tc>
+        <w:tc>
+          <w:tcPr>
+            <w:tcW w:type="dxa" w:w="2880"/>
+          </w:tcPr>
+          <w:p>
+            <w:r>
+              <w:rPr>
+                <w:sz w:val="18"/>
+              </w:rPr>
+              <w:t>Produces an uncertainty interval calibrated on a held-out calibration slice rather than on ensemble spread, and labels each prediction as interpolating, extrapolating, or falling back to the correlation alone</w:t>
+            </w:r>
+          </w:p>
+        </w:tc>
+      </w:tr>
+    </w:tbl>
+    <w:p/>
+    <w:p>
+      <w:r>
+        <w:t>This hierarchy exists specifically because the alternative, simpler designs tested earlier in this paper did not hold up. A router that tried to classify an input as familiar or unfamiliar and send it to either a learned model or the physics baseline was tested and rejected: even its best version reached only a median R-squared of 0.136 on entirely unseen datasets, worse than the physics baseline alone at 0.336, because the routing gate could not reliably tell an unseen fluid apart from a familiar one, the same fluid-identity blind spot discussed in Section 1.8. Layer 3 replaces that router with a dial rather than a switch: trust scales how much the correction is allowed to move the prediction, but it never chooses between two entirely different models the way a router does, so a wrong trust estimate degrades the result gradually rather than catastrophically.</w:t>
+      </w:r>
+    </w:p>
+    <w:p>
+      <w:r>
+        <w:t>Layer 2's correction is deliberately pooled across all sources rather than trained separately per dataset or routed through a mixture-of-experts gate, because both alternatives were tried first and both underperformed a single pooled model, as Table 5 already summarizes. Layer 2 can, however, be adapted efficiently to a new domain using low-rank adapters rather than full retraining, reaching an R-squared of 0.685 while updating only 8.8 percent of its parameters, against 0.696 for updating all of them, which matters in practice because it makes fine-tuning the correction on a new fluid or surface considerably cheaper without giving up much accuracy.</w:t>
+      </w:r>
+    </w:p>
+    <w:p>
+      <w:r>
+        <w:t>The inference procedure built on top of this hierarchy also encodes several of this paper's own findings as explicit refusals rather than silent extrapolation: it declines to produce a prediction for zero mass flux, since that is pool boiling and the physics backbone here is not valid there, for negative or physically impossible geometry, or for a fluid the underlying property routine does not recognize, closing off exactly the kind of silent, confident, wrong answer described as a property-lookup failure in Section 1.8.</w:t>
+      </w:r>
+    </w:p>
+    <w:p>
+      <w:pPr>
+        <w:pStyle w:val="Heading2"/>
+      </w:pPr>
+      <w:r>
+        <w:t>3.4 Data Splitting Strategy</w:t>
+      </w:r>
+    </w:p>
+    <w:p>
+      <w:r>
+        <w:t>A large part of this paper is really an argument about how a CHF model should be evaluated, and that argument starts with a plain warning worth stating in the outline's own terms: do not rely only on an ordinary 80 percent training, 20 percent testing random split. If the same surface, the same laboratory, or even the same narrow condition range has rows in both the training set and the testing set, a model can score very well by learning the characteristics of that specific surface or source rather than the underlying physics of CHF, and a random split has no way of preventing this, since it does not look at where a row came from before deciding which side of the split it lands on. Every result in Table 2, Table 3, and Table 4 above exists specifically to demonstrate how large that effect actually is, and this section collects the split definitions themselves in one place.</w:t>
+      </w:r>
+    </w:p>
+    <w:p>
+      <w:r>
+        <w:t>This project used two related sets of splits at different stages. The earliest phase, working only with the 2006 look-up table, used three splits of increasing severity, summarized in Table 7.</w:t>
+      </w:r>
+    </w:p>
+    <w:p>
+      <w:r>
+        <w:rPr>
+          <w:i/>
+          <w:sz w:val="18"/>
+        </w:rPr>
+        <w:t>Table 7. Split definitions used in this project's earliest phase, on the 2006 Groeneveld look-up table alone.</w:t>
+      </w:r>
+    </w:p>
+    <w:tbl>
+      <w:tblPr>
+        <w:tblStyle w:val="LightGrid-Accent1"/>
+        <w:tblW w:type="auto" w:w="0"/>
+        <w:tblLook w:firstColumn="1" w:firstRow="1" w:lastColumn="0" w:lastRow="0" w:noHBand="0" w:noVBand="1" w:val="04A0"/>
+      </w:tblPr>
+      <w:tblGrid>
+        <w:gridCol w:w="2880"/>
+        <w:gridCol w:w="2880"/>
+        <w:gridCol w:w="2880"/>
+      </w:tblGrid>
+      <w:tr>
+        <w:tc>
+          <w:tcPr>
+            <w:tcW w:type="dxa" w:w="2880"/>
+          </w:tcPr>
+          <w:p>
+            <w:r>
+              <w:rPr>
+                <w:b/>
+                <w:sz w:val="18"/>
+              </w:rPr>
+              <w:t>Split</w:t>
+            </w:r>
+          </w:p>
+        </w:tc>
+        <w:tc>
+          <w:tcPr>
+            <w:tcW w:type="dxa" w:w="2880"/>
+          </w:tcPr>
+          <w:p>
+            <w:r>
+              <w:rPr>
+                <w:b/>
+                <w:sz w:val="18"/>
+              </w:rPr>
+              <w:t>Construction</w:t>
+            </w:r>
+          </w:p>
+        </w:tc>
+        <w:tc>
+          <w:tcPr>
+            <w:tcW w:type="dxa" w:w="2880"/>
+          </w:tcPr>
+          <w:p>
+            <w:r>
+              <w:rPr>
+                <w:b/>
+                <w:sz w:val="18"/>
+              </w:rPr>
+              <w:t>Question it answers</w:t>
+            </w:r>
+          </w:p>
+        </w:tc>
+      </w:tr>
+      <w:tr>
+        <w:tc>
+          <w:tcPr>
+            <w:tcW w:type="dxa" w:w="2880"/>
+          </w:tcPr>
+          <w:p>
+            <w:r>
+              <w:rPr>
+                <w:sz w:val="18"/>
+              </w:rPr>
+              <w:t>Split A</w:t>
+            </w:r>
+          </w:p>
+        </w:tc>
+        <w:tc>
+          <w:tcPr>
+            <w:tcW w:type="dxa" w:w="2880"/>
+          </w:tcPr>
+          <w:p>
+            <w:r>
+              <w:rPr>
+                <w:sz w:val="18"/>
+              </w:rPr>
+              <w:t>Random 80/20</w:t>
+            </w:r>
+          </w:p>
+        </w:tc>
+        <w:tc>
+          <w:tcPr>
+            <w:tcW w:type="dxa" w:w="2880"/>
+          </w:tcPr>
+          <w:p>
+            <w:r>
+              <w:rPr>
+                <w:sz w:val="18"/>
+              </w:rPr>
+              <w:t>Interpolation inside the grid (the optimistic case)</w:t>
+            </w:r>
+          </w:p>
+        </w:tc>
+      </w:tr>
+      <w:tr>
+        <w:tc>
+          <w:tcPr>
+            <w:tcW w:type="dxa" w:w="2880"/>
+          </w:tcPr>
+          <w:p>
+            <w:r>
+              <w:rPr>
+                <w:sz w:val="18"/>
+              </w:rPr>
+              <w:t>Split B</w:t>
+            </w:r>
+          </w:p>
+        </w:tc>
+        <w:tc>
+          <w:tcPr>
+            <w:tcW w:type="dxa" w:w="2880"/>
+          </w:tcPr>
+          <w:p>
+            <w:r>
+              <w:rPr>
+                <w:sz w:val="18"/>
+              </w:rPr>
+              <w:t>Interior pressure holdout</w:t>
+            </w:r>
+          </w:p>
+        </w:tc>
+        <w:tc>
+          <w:tcPr>
+            <w:tcW w:type="dxa" w:w="2880"/>
+          </w:tcPr>
+          <w:p>
+            <w:r>
+              <w:rPr>
+                <w:sz w:val="18"/>
+              </w:rPr>
+              <w:t>A moderately difficult, still largely interpolative case</w:t>
+            </w:r>
+          </w:p>
+        </w:tc>
+      </w:tr>
+      <w:tr>
+        <w:tc>
+          <w:tcPr>
+            <w:tcW w:type="dxa" w:w="2880"/>
+          </w:tcPr>
+          <w:p>
+            <w:r>
+              <w:rPr>
+                <w:sz w:val="18"/>
+              </w:rPr>
+              <w:t>Split C</w:t>
+            </w:r>
+          </w:p>
+        </w:tc>
+        <w:tc>
+          <w:tcPr>
+            <w:tcW w:type="dxa" w:w="2880"/>
+          </w:tcPr>
+          <w:p>
+            <w:r>
+              <w:rPr>
+                <w:sz w:val="18"/>
+              </w:rPr>
+              <w:t>Edge-of-range pressure extrapolation</w:t>
+            </w:r>
+          </w:p>
+        </w:tc>
+        <w:tc>
+          <w:tcPr>
+            <w:tcW w:type="dxa" w:w="2880"/>
+          </w:tcPr>
+          <w:p>
+            <w:r>
+              <w:rPr>
+                <w:sz w:val="18"/>
+              </w:rPr>
+              <w:t>The honest test of whether a model generalizes at all</w:t>
+            </w:r>
+          </w:p>
+        </w:tc>
+      </w:tr>
+    </w:tbl>
+    <w:p/>
+    <w:p>
+      <w:r>
+        <w:t>Once real, multi-source experimental data replaced the look-up table as the main training target, this project moved to four validation strategies, matching the outline's own Strategy I through Strategy IV and used consistently for every result in Table 2 and Table 3 above.</w:t>
+      </w:r>
+    </w:p>
+    <w:p>
+      <w:r>
+        <w:rPr>
+          <w:i/>
+          <w:sz w:val="18"/>
+        </w:rPr>
+        <w:t>Table 8. The four validation strategies used from Section 1.5 onward, applied consistently across every model comparison in this paper.</w:t>
+      </w:r>
+    </w:p>
+    <w:tbl>
+      <w:tblPr>
+        <w:tblStyle w:val="LightGrid-Accent1"/>
+        <w:tblW w:type="auto" w:w="0"/>
+        <w:tblLook w:firstColumn="1" w:firstRow="1" w:lastColumn="0" w:lastRow="0" w:noHBand="0" w:noVBand="1" w:val="04A0"/>
+      </w:tblPr>
+      <w:tblGrid>
+        <w:gridCol w:w="2880"/>
+        <w:gridCol w:w="2880"/>
+        <w:gridCol w:w="2880"/>
+      </w:tblGrid>
+      <w:tr>
+        <w:tc>
+          <w:tcPr>
+            <w:tcW w:type="dxa" w:w="2880"/>
+          </w:tcPr>
+          <w:p>
+            <w:r>
+              <w:rPr>
+                <w:b/>
+                <w:sz w:val="18"/>
+              </w:rPr>
+              <w:t>Strategy</w:t>
+            </w:r>
+          </w:p>
+        </w:tc>
+        <w:tc>
+          <w:tcPr>
+            <w:tcW w:type="dxa" w:w="2880"/>
+          </w:tcPr>
+          <w:p>
+            <w:r>
+              <w:rPr>
+                <w:b/>
+                <w:sz w:val="18"/>
+              </w:rPr>
+              <w:t>Construction</w:t>
+            </w:r>
+          </w:p>
+        </w:tc>
+        <w:tc>
+          <w:tcPr>
+            <w:tcW w:type="dxa" w:w="2880"/>
+          </w:tcPr>
+          <w:p>
+            <w:r>
+              <w:rPr>
+                <w:b/>
+                <w:sz w:val="18"/>
+              </w:rPr>
+              <w:t>Question it answers</w:t>
+            </w:r>
+          </w:p>
+        </w:tc>
+      </w:tr>
+      <w:tr>
+        <w:tc>
+          <w:tcPr>
+            <w:tcW w:type="dxa" w:w="2880"/>
+          </w:tcPr>
+          <w:p>
+            <w:r>
+              <w:rPr>
+                <w:sz w:val="18"/>
+              </w:rPr>
+              <w:t>Strategy I: Random split</w:t>
+            </w:r>
+          </w:p>
+        </w:tc>
+        <w:tc>
+          <w:tcPr>
+            <w:tcW w:type="dxa" w:w="2880"/>
+          </w:tcPr>
+          <w:p>
+            <w:r>
+              <w:rPr>
+                <w:sz w:val="18"/>
+              </w:rPr>
+              <w:t>Rows assigned to train or test at random, stratified by source</w:t>
+            </w:r>
+          </w:p>
+        </w:tc>
+        <w:tc>
+          <w:tcPr>
+            <w:tcW w:type="dxa" w:w="2880"/>
+          </w:tcPr>
+          <w:p>
+            <w:r>
+              <w:rPr>
+                <w:sz w:val="18"/>
+              </w:rPr>
+              <w:t>Interpolation; what most published CHF machine learning work actually reports</w:t>
+            </w:r>
+          </w:p>
+        </w:tc>
+      </w:tr>
+      <w:tr>
+        <w:tc>
+          <w:tcPr>
+            <w:tcW w:type="dxa" w:w="2880"/>
+          </w:tcPr>
+          <w:p>
+            <w:r>
+              <w:rPr>
+                <w:sz w:val="18"/>
+              </w:rPr>
+              <w:t>Strategy II: Condition-wise split</w:t>
+            </w:r>
+          </w:p>
+        </w:tc>
+        <w:tc>
+          <w:tcPr>
+            <w:tcW w:type="dxa" w:w="2880"/>
+          </w:tcPr>
+          <w:p>
+            <w:r>
+              <w:rPr>
+                <w:sz w:val="18"/>
+              </w:rPr>
+              <w:t>The highest-pressure portion of each source held out, rest used for training</w:t>
+            </w:r>
+          </w:p>
+        </w:tc>
+        <w:tc>
+          <w:tcPr>
+            <w:tcW w:type="dxa" w:w="2880"/>
+          </w:tcPr>
+          <w:p>
+            <w:r>
+              <w:rPr>
+                <w:sz w:val="18"/>
+              </w:rPr>
+              <w:t>Can the model handle operating conditions it has not directly seen, within a familiar source?</w:t>
+            </w:r>
+          </w:p>
+        </w:tc>
+      </w:tr>
+      <w:tr>
+        <w:tc>
+          <w:tcPr>
+            <w:tcW w:type="dxa" w:w="2880"/>
+          </w:tcPr>
+          <w:p>
+            <w:r>
+              <w:rPr>
+                <w:sz w:val="18"/>
+              </w:rPr>
+              <w:t>Strategy III: Surface-wise split</w:t>
+            </w:r>
+          </w:p>
+        </w:tc>
+        <w:tc>
+          <w:tcPr>
+            <w:tcW w:type="dxa" w:w="2880"/>
+          </w:tcPr>
+          <w:p>
+            <w:r>
+              <w:rPr>
+                <w:sz w:val="18"/>
+              </w:rPr>
+              <w:t>One or more entire surface types or geometries withheld completely from training</w:t>
+            </w:r>
+          </w:p>
+        </w:tc>
+        <w:tc>
+          <w:tcPr>
+            <w:tcW w:type="dxa" w:w="2880"/>
+          </w:tcPr>
+          <w:p>
+            <w:r>
+              <w:rPr>
+                <w:sz w:val="18"/>
+              </w:rPr>
+              <w:t>Can the model handle a surface or geometry it has never seen at all?</w:t>
+            </w:r>
+          </w:p>
+        </w:tc>
+      </w:tr>
+      <w:tr>
+        <w:tc>
+          <w:tcPr>
+            <w:tcW w:type="dxa" w:w="2880"/>
+          </w:tcPr>
+          <w:p>
+            <w:r>
+              <w:rPr>
+                <w:sz w:val="18"/>
+              </w:rPr>
+              <w:t>Strategy IV: Leave-one-source-out cross-validation</w:t>
+            </w:r>
+          </w:p>
+        </w:tc>
+        <w:tc>
+          <w:tcPr>
+            <w:tcW w:type="dxa" w:w="2880"/>
+          </w:tcPr>
+          <w:p>
+            <w:r>
+              <w:rPr>
+                <w:sz w:val="18"/>
+              </w:rPr>
+              <w:t>Each independent source held out in turn, with results pooled across all folds</w:t>
+            </w:r>
+          </w:p>
+        </w:tc>
+        <w:tc>
+          <w:tcPr>
+            <w:tcW w:type="dxa" w:w="2880"/>
+          </w:tcPr>
+          <w:p>
+            <w:r>
+              <w:rPr>
+                <w:sz w:val="18"/>
+              </w:rPr>
+              <w:t>Can the model handle an entirely new laboratory, repeated across every source in the dataset?</w:t>
+            </w:r>
+          </w:p>
+        </w:tc>
+      </w:tr>
+    </w:tbl>
+    <w:p/>
+    <w:p>
+      <w:r>
+        <w:t>Two further points about how these strategies were implemented are worth recording, because both were discovered as mistakes and then fixed, and both are the kind of error that is easy to make without noticing. First, after building these splits, this project added an automatic check for degenerate groupings: a Strategy III or Strategy IV split where every group happens to contain only one row is silently identical to a random split, and a split where one group exceeds 95 percent purity from a single source is effectively Strategy IV wearing Strategy III's label. Both of these had, in fact, occurred earlier in this project and been reported as if they were the intended, harder protocol, until the automatic check caught them. Second, three grouped splits used at one point were labelled as testing generalization to an unseen laboratory when the grouping column they used actually corresponded to something else entirely, a pressure range in one case and individual coil geometries in another, both audited and renamed once discovered. Neither error changed the paper's overall conclusions, since the same pattern, strong scores on easy splits and weak or collapsing scores on hard ones, showed up consistently regardless, but both are recorded here because a validation strategy that is not actually testing what its name claims is a quiet way for an otherwise careful project to end up overstating how well a model generalizes.</w:t>
+      </w:r>
+    </w:p>
+    <w:p>
+      <w:r>
+        <w:t>The practical rule that came out of all four strategies, repeated across every model in Tables 2 through 4, is simple to state and easy to forget: a single reported R-squared value is only meaningful once the split it was measured on is stated alongside it. The same model can score above 0.9 and below minus 100 depending entirely on which of the four strategies in Table 8 was used to test it, and any CHF prediction result presented in this paper always names which strategy produced it for exactly this reason.</w:t>
+      </w:r>
+    </w:p>
     <w:sectPr>
       <w:pgSz w:w="12240" w:h="15840"/>
       <w:pgMar w:top="1440" w:right="1800" w:bottom="1440" w:left="1800" w:header="720" w:footer="720" w:gutter="0"/>

</xml_diff>

<commit_message>
many more write-up changes
</commit_message>
<xml_diff>
--- a/CHF_Research_Paper.docx
+++ b/CHF_Research_Paper.docx
@@ -679,10 +679,189 @@
     </w:p>
     <w:p>
       <w:pPr>
+        <w:pStyle w:val="Heading2"/>
+      </w:pPr>
+      <w:r>
+        <w:t>2.2 Boiling Regimes and Heating Configurations in the Merged Database</w:t>
+      </w:r>
+    </w:p>
+    <w:p>
+      <w:r>
+        <w:t>The six detection criteria above apply across a database that is itself split unevenly across boiling regime and heating configuration, and it is worth making that composition explicit before Section 3 starts training models on it. Counted by source file, the eleven datasets used across this project split into flow boiling with uniform axial heating (the NRC Groeneveld database and the KAERI uniform set, together 25,230 rows), flow boiling with non-uniform axial heating (the KAERI non-uniform set, 888 rows, the only dataset of this kind this project holds), flow boiling where the source material does not specify a heating profile one way or the other (Zhao 2020, the Helical R-123 and Hardik sets, and the Pioro R-134a holdout, together 2,601 rows), and pool boiling on engineered surfaces (the pin-fin, strip-heater, and consolidated surface-master sets, together 330 rows). Figure 2 shows this breakdown directly.</w:t>
+      </w:r>
+    </w:p>
+    <w:p/>
+    <w:p>
+      <w:pPr>
+        <w:jc w:val="center"/>
+      </w:pPr>
+      <w:r>
+        <w:drawing>
+          <wp:inline xmlns:a="http://schemas.openxmlformats.org/drawingml/2006/main" xmlns:pic="http://schemas.openxmlformats.org/drawingml/2006/picture">
+            <wp:extent cx="5760720" cy="2807160"/>
+            <wp:docPr id="2" name="Picture 2"/>
+            <wp:cNvGraphicFramePr>
+              <a:graphicFrameLocks noChangeAspect="1"/>
+            </wp:cNvGraphicFramePr>
+            <a:graphic>
+              <a:graphicData uri="http://schemas.openxmlformats.org/drawingml/2006/picture">
+                <pic:pic>
+                  <pic:nvPicPr>
+                    <pic:cNvPr id="0" name="fig_dataset_composition.png"/>
+                    <pic:cNvPicPr/>
+                  </pic:nvPicPr>
+                  <pic:blipFill>
+                    <a:blip r:embed="rId10"/>
+                    <a:stretch>
+                      <a:fillRect/>
+                    </a:stretch>
+                  </pic:blipFill>
+                  <pic:spPr>
+                    <a:xfrm>
+                      <a:off x="0" y="0"/>
+                      <a:ext cx="5760720" cy="2807160"/>
+                    </a:xfrm>
+                    <a:prstGeom prst="rect"/>
+                  </pic:spPr>
+                </pic:pic>
+              </a:graphicData>
+            </a:graphic>
+          </wp:inline>
+        </w:drawing>
+      </w:r>
+    </w:p>
+    <w:p>
+      <w:pPr>
+        <w:jc w:val="center"/>
+      </w:pPr>
+      <w:r>
+        <w:rPr>
+          <w:i/>
+          <w:sz w:val="18"/>
+        </w:rPr>
+        <w:t>Figure 2. Database composition by boiling regime and heating configuration, one bar per source file (left) and grouped into four categories (right). Both axes are log scaled because row counts span nearly three orders of magnitude, from 55 to 24,579.</w:t>
+      </w:r>
+    </w:p>
+    <w:p>
+      <w:r>
+        <w:t>This imbalance matters for how the results in Section 3 should be read. Pool boiling makes up only about 1 percent of the merged database by row count, which is part of why Section 3.3's inference procedure declines to produce a prediction for zero mass flux rather than trusting the pooled correction to have learned pool boiling well from so little data. Non-uniform axial heating is similarly a minority case, a single 888-row dataset next to 25,230 rows of uniform heating, so any result reported for the KAERI non-uniform set later in this paper, including in Table 4, is a result on this project's only non-uniform-heating source, not an average over several. Figure 3 shows directly what that non-uniform condition looks like in practice: local quality plotted along the heated length for a sample of individual tests from the KAERI non-uniform set, each tracing out its own axial profile rather than the single monotonic curve a uniformly heated tube would produce.</w:t>
+      </w:r>
+    </w:p>
+    <w:p/>
+    <w:p>
+      <w:pPr>
+        <w:jc w:val="center"/>
+      </w:pPr>
+      <w:r>
+        <w:drawing>
+          <wp:inline xmlns:a="http://schemas.openxmlformats.org/drawingml/2006/main" xmlns:pic="http://schemas.openxmlformats.org/drawingml/2006/picture">
+            <wp:extent cx="5760720" cy="2263601"/>
+            <wp:docPr id="3" name="Picture 3"/>
+            <wp:cNvGraphicFramePr>
+              <a:graphicFrameLocks noChangeAspect="1"/>
+            </wp:cNvGraphicFramePr>
+            <a:graphic>
+              <a:graphicData uri="http://schemas.openxmlformats.org/drawingml/2006/picture">
+                <pic:pic>
+                  <pic:nvPicPr>
+                    <pic:cNvPr id="0" name="fig_axial_quality_profiles_nonuniform.png"/>
+                    <pic:cNvPicPr/>
+                  </pic:nvPicPr>
+                  <pic:blipFill>
+                    <a:blip r:embed="rId11"/>
+                    <a:stretch>
+                      <a:fillRect/>
+                    </a:stretch>
+                  </pic:blipFill>
+                  <pic:spPr>
+                    <a:xfrm>
+                      <a:off x="0" y="0"/>
+                      <a:ext cx="5760720" cy="2263601"/>
+                    </a:xfrm>
+                    <a:prstGeom prst="rect"/>
+                  </pic:spPr>
+                </pic:pic>
+              </a:graphicData>
+            </a:graphic>
+          </wp:inline>
+        </w:drawing>
+      </w:r>
+    </w:p>
+    <w:p>
+      <w:pPr>
+        <w:jc w:val="center"/>
+      </w:pPr>
+      <w:r>
+        <w:rPr>
+          <w:i/>
+          <w:sz w:val="18"/>
+        </w:rPr>
+        <w:t>Figure 3. Axial quality profiles for a sample of individual tests in the KAERI non-uniform heating dataset (left: how many axial points each test reports; right: local quality against axial position for eight sample tests), illustrating what a non-uniform axial heat flux profile actually looks like at the level of a single test.</w:t>
+      </w:r>
+    </w:p>
+    <w:p>
+      <w:pPr>
         <w:pStyle w:val="Heading1"/>
       </w:pPr>
       <w:r>
         <w:t>3. Machine-Learning Methodology</w:t>
+      </w:r>
+    </w:p>
+    <w:p>
+      <w:r>
+        <w:t>Figure 4 maps the rest of this section before the detail begins: raw sources of the kind just described in Section 2 are merged and preprocessed (Section 3.1), passed through the physics-plus-learned-correction hierarchy (Section 3.3), evaluated under four validation strategies (Section 3.4), and turned into a final prediction carrying its own calibrated uncertainty interval.</w:t>
+      </w:r>
+    </w:p>
+    <w:p/>
+    <w:p>
+      <w:pPr>
+        <w:jc w:val="center"/>
+      </w:pPr>
+      <w:r>
+        <w:drawing>
+          <wp:inline xmlns:a="http://schemas.openxmlformats.org/drawingml/2006/main" xmlns:pic="http://schemas.openxmlformats.org/drawingml/2006/picture">
+            <wp:extent cx="5760720" cy="2128608"/>
+            <wp:docPr id="4" name="Picture 4"/>
+            <wp:cNvGraphicFramePr>
+              <a:graphicFrameLocks noChangeAspect="1"/>
+            </wp:cNvGraphicFramePr>
+            <a:graphic>
+              <a:graphicData uri="http://schemas.openxmlformats.org/drawingml/2006/picture">
+                <pic:pic>
+                  <pic:nvPicPr>
+                    <pic:cNvPr id="0" name="fig_pipeline_overview.png"/>
+                    <pic:cNvPicPr/>
+                  </pic:nvPicPr>
+                  <pic:blipFill>
+                    <a:blip r:embed="rId12"/>
+                    <a:stretch>
+                      <a:fillRect/>
+                    </a:stretch>
+                  </pic:blipFill>
+                  <pic:spPr>
+                    <a:xfrm>
+                      <a:off x="0" y="0"/>
+                      <a:ext cx="5760720" cy="2128608"/>
+                    </a:xfrm>
+                    <a:prstGeom prst="rect"/>
+                  </pic:spPr>
+                </pic:pic>
+              </a:graphicData>
+            </a:graphic>
+          </wp:inline>
+        </w:drawing>
+      </w:r>
+    </w:p>
+    <w:p>
+      <w:pPr>
+        <w:jc w:val="center"/>
+      </w:pPr>
+      <w:r>
+        <w:rPr>
+          <w:i/>
+          <w:sz w:val="18"/>
+        </w:rPr>
+        <w:t>Figure 4. End-to-end pipeline from raw CHF measurements to a calibrated prediction, naming the section that describes each stage in detail.</w:t>
       </w:r>
     </w:p>
     <w:p>
@@ -707,7 +886,7 @@
         <w:drawing>
           <wp:inline xmlns:a="http://schemas.openxmlformats.org/drawingml/2006/main" xmlns:pic="http://schemas.openxmlformats.org/drawingml/2006/picture">
             <wp:extent cx="5760720" cy="2945132"/>
-            <wp:docPr id="2" name="Picture 2"/>
+            <wp:docPr id="5" name="Picture 5"/>
             <wp:cNvGraphicFramePr>
               <a:graphicFrameLocks noChangeAspect="1"/>
             </wp:cNvGraphicFramePr>
@@ -719,7 +898,7 @@
                     <pic:cNvPicPr/>
                   </pic:nvPicPr>
                   <pic:blipFill>
-                    <a:blip r:embed="rId10"/>
+                    <a:blip r:embed="rId13"/>
                     <a:stretch>
                       <a:fillRect/>
                     </a:stretch>
@@ -747,7 +926,7 @@
           <w:i/>
           <w:sz w:val="18"/>
         </w:rPr>
-        <w:t>Figure 2. Exploratory data analysis on the real merged dataset (28,470 rows): the CHF distribution spans about three orders of magnitude (left), and row counts per geometry family are highly imbalanced, from 27,557 tube rows down to 48 plate rows (right, log scale).</w:t>
+        <w:t>Figure 5. Exploratory data analysis on the real merged dataset (28,470 rows): the CHF distribution spans about three orders of magnitude (left), and row counts per geometry family are highly imbalanced, from 27,557 tube rows down to 48 plate rows (right, log scale).</w:t>
       </w:r>
     </w:p>
     <w:p/>
@@ -759,7 +938,7 @@
         <w:drawing>
           <wp:inline xmlns:a="http://schemas.openxmlformats.org/drawingml/2006/main" xmlns:pic="http://schemas.openxmlformats.org/drawingml/2006/picture">
             <wp:extent cx="4754880" cy="3505981"/>
-            <wp:docPr id="3" name="Picture 3"/>
+            <wp:docPr id="6" name="Picture 6"/>
             <wp:cNvGraphicFramePr>
               <a:graphicFrameLocks noChangeAspect="1"/>
             </wp:cNvGraphicFramePr>
@@ -771,7 +950,7 @@
                     <pic:cNvPicPr/>
                   </pic:nvPicPr>
                   <pic:blipFill>
-                    <a:blip r:embed="rId11"/>
+                    <a:blip r:embed="rId14"/>
                     <a:stretch>
                       <a:fillRect/>
                     </a:stretch>
@@ -799,7 +978,7 @@
           <w:i/>
           <w:sz w:val="18"/>
         </w:rPr>
-        <w:t>Figure 3. CHF against pressure for the three largest geometry families in the merged dataset. Only three series are shown because more than three categorical colors on a scatter plot stop being reliably distinguishable, including under color-vision deficiency.</w:t>
+        <w:t>Figure 6. CHF against pressure for the three largest geometry families in the merged dataset. Only three series are shown because more than three categorical colors on a scatter plot stop being reliably distinguishable, including under color-vision deficiency.</w:t>
       </w:r>
     </w:p>
     <w:p>
@@ -834,6 +1013,58 @@
         <w:t>Feature correlation analysis. Run naively on data pooled from many independent laboratories, a feature correlation analysis in this project turned out to be actively misleading rather than simply noisy. Computed across pooled engineered-surface data, the correlation between surface roughness and CHF came out negative, but computed within each individual study it came out positive, matching the physical mechanism the source papers themselves describe. Extending the same kind of analysis to ask how much variance a purely administrative variable, which laboratory produced a given row, explains on its own, rather than only checking physical features against the target, is what first revealed that source identity alone can account for the majority of the apparent signal in a small dataset. Correlation analysis was also used directly as a leakage-detection tool rather than only a feature-selection one: several columns in the merged data, including one combination of electrical power, perimeter, and flow area in one dataset, and a heater-power column in another, reconstructed the CHF target almost exactly through simple algebra once checked, and were excluded once that reconstruction was confirmed. In this project, feature correlation analysis removed at least as much as it selected.</w:t>
       </w:r>
     </w:p>
+    <w:p/>
+    <w:p>
+      <w:pPr>
+        <w:jc w:val="center"/>
+      </w:pPr>
+      <w:r>
+        <w:drawing>
+          <wp:inline xmlns:a="http://schemas.openxmlformats.org/drawingml/2006/main" xmlns:pic="http://schemas.openxmlformats.org/drawingml/2006/picture">
+            <wp:extent cx="3931920" cy="3487613"/>
+            <wp:docPr id="7" name="Picture 7"/>
+            <wp:cNvGraphicFramePr>
+              <a:graphicFrameLocks noChangeAspect="1"/>
+            </wp:cNvGraphicFramePr>
+            <a:graphic>
+              <a:graphicData uri="http://schemas.openxmlformats.org/drawingml/2006/picture">
+                <pic:pic>
+                  <pic:nvPicPr>
+                    <pic:cNvPr id="0" name="fig_correlation_heatmap_nrc.png"/>
+                    <pic:cNvPicPr/>
+                  </pic:nvPicPr>
+                  <pic:blipFill>
+                    <a:blip r:embed="rId15"/>
+                    <a:stretch>
+                      <a:fillRect/>
+                    </a:stretch>
+                  </pic:blipFill>
+                  <pic:spPr>
+                    <a:xfrm>
+                      <a:off x="0" y="0"/>
+                      <a:ext cx="3931920" cy="3487613"/>
+                    </a:xfrm>
+                    <a:prstGeom prst="rect"/>
+                  </pic:spPr>
+                </pic:pic>
+              </a:graphicData>
+            </a:graphic>
+          </wp:inline>
+        </w:drawing>
+      </w:r>
+    </w:p>
+    <w:p>
+      <w:pPr>
+        <w:jc w:val="center"/>
+      </w:pPr>
+      <w:r>
+        <w:rPr>
+          <w:i/>
+          <w:sz w:val="18"/>
+        </w:rPr>
+        <w:t>Figure 7. Pairwise correlation matrix for the NRC/Groeneveld sub-dataset (24,579 rows, this project's single largest source), the kind of within-source correlation check described above. Mass flux and outlet quality show the strongest linear association with CHF here (0.42 and -0.55); note that this is one source's own internal correlation structure, not the pooled, cross-source analysis whose sign-reversal problem is discussed in the same paragraph.</w:t>
+      </w:r>
+    </w:p>
     <w:p>
       <w:pPr>
         <w:pStyle w:val="ListBullet"/>
@@ -862,7 +1093,7 @@
     </w:p>
     <w:p>
       <w:r>
-        <w:t>Model 1, Artificial Neural Network (ANN / MLP). A fully connected multilayer perceptron, trained on the logarithm of CHF rather than the raw value, was this project's primary nonlinear baseline throughout every phase of the work, and a Transformer encoder variant was added later specifically to test whether attention-based architecture offered any advantage over a plain feedforward network. The earliest test of this model, on the 2006 Groeneveld look-up table alone, already showed the pattern that shaped the rest of the project: excellent accuracy under an easy split, and a sharp decline under a genuinely hard one. Table 1 shows this alongside three other baselines evaluated the same way, using three splits of increasing difficulty: Split A, an ordinary random 80/20 split; Split B, an interior pressure holdout; and Split C, an edge-of-range pressure extrapolation, described further in Section 3.4.</w:t>
+        <w:t>Model 1, Artificial Neural Network (ANN / MLP), later joined by a Transformer encoder variant. Table 1 summarizes this project's earliest phase, the 2006 Groeneveld look-up table alone, across three splits of increasing difficulty (Split A: random; Split B: interior pressure holdout; Split C: edge-of-range extrapolation; Section 3.4), and already showed the pattern the rest of this paper returns to: strong accuracy under an easy split, sharp decline under a hard one.</w:t>
       </w:r>
     </w:p>
     <w:p>
@@ -1298,7 +1529,7 @@
     <w:p/>
     <w:p>
       <w:r>
-        <w:t>Two things from this early phase carried forward into everything that followed. First, deterministic grid interpolation, simply reading the value off the look-up table itself with no learning involved, held its accuracy far better than any learned model under genuine extrapolation, the first sign that a physical anchor might matter more than model choice. Second, an internal review had initially ranked a different blend first, at an R-squared of 0.855 on Split C, but multi-seed verification showed that result did not replicate, the underlying model averaged 0.547 across 30 random seeds and not one seed reached 0.84 on its own. The claim was withdrawn, and from that point on, every number in this project is reported as a multi-seed mean, never a single run.</w:t>
+        <w:t>Deterministic grid interpolation held up far better than any learned model under genuine extrapolation here, the first sign that a physical anchor can matter more than model choice, a lead this paper follows through to the proposed hybrid below. (An initially reported 0.855 blend result did not replicate under multi-seed verification and was withdrawn; every number in this paper is a multi-seed mean, never a single run.)</w:t>
       </w:r>
     </w:p>
     <w:p>
@@ -1751,7 +1982,7 @@
         <w:drawing>
           <wp:inline xmlns:a="http://schemas.openxmlformats.org/drawingml/2006/main" xmlns:pic="http://schemas.openxmlformats.org/drawingml/2006/picture">
             <wp:extent cx="5760720" cy="3153236"/>
-            <wp:docPr id="4" name="Picture 4"/>
+            <wp:docPr id="8" name="Picture 8"/>
             <wp:cNvGraphicFramePr>
               <a:graphicFrameLocks noChangeAspect="1"/>
             </wp:cNvGraphicFramePr>
@@ -1763,7 +1994,7 @@
                     <pic:cNvPicPr/>
                   </pic:nvPicPr>
                   <pic:blipFill>
-                    <a:blip r:embed="rId12"/>
+                    <a:blip r:embed="rId16"/>
                     <a:stretch>
                       <a:fillRect/>
                     </a:stretch>
@@ -1791,7 +2022,7 @@
           <w:i/>
           <w:sz w:val="18"/>
         </w:rPr>
-        <w:t>Figure 4. Table 2 shown visually. The y-axis uses a symmetric log scale because scores range from 0.97 to -4133; a linear axis would make every bar except PINN's look identical.</w:t>
+        <w:t>Figure 8. Table 2 shown visually. The y-axis uses a symmetric log scale because scores range from 0.97 to -4133; a linear axis would make every bar except PINN's look identical.</w:t>
       </w:r>
     </w:p>
     <w:p>
@@ -3020,7 +3251,7 @@
         <w:drawing>
           <wp:inline xmlns:a="http://schemas.openxmlformats.org/drawingml/2006/main" xmlns:pic="http://schemas.openxmlformats.org/drawingml/2006/picture">
             <wp:extent cx="5760720" cy="2790625"/>
-            <wp:docPr id="5" name="Picture 5"/>
+            <wp:docPr id="9" name="Picture 9"/>
             <wp:cNvGraphicFramePr>
               <a:graphicFrameLocks noChangeAspect="1"/>
             </wp:cNvGraphicFramePr>
@@ -3032,7 +3263,7 @@
                     <pic:cNvPicPr/>
                   </pic:nvPicPr>
                   <pic:blipFill>
-                    <a:blip r:embed="rId13"/>
+                    <a:blip r:embed="rId17"/>
                     <a:stretch>
                       <a:fillRect/>
                     </a:stretch>
@@ -3060,7 +3291,7 @@
           <w:i/>
           <w:sz w:val="18"/>
         </w:rPr>
-        <w:t>Figure 5. Table 4 shown visually: R-squared by dataset (left, symmetric log scale) and the proposed hybrid's within +/-10% accuracy by dataset (right).</w:t>
+        <w:t>Figure 9. Table 4 shown visually: R-squared by dataset (left, symmetric log scale) and the proposed hybrid's within +/-10% accuracy by dataset (right).</w:t>
       </w:r>
     </w:p>
     <w:p>
@@ -3070,7 +3301,64 @@
     </w:p>
     <w:p>
       <w:r>
-        <w:t>Other models and configurations explored. The five models above are the headline comparison, but they are far from everything this project tried. Across several rounds of hyperparameter tuning and architecture search, involving roughly thirty configurations in the earliest phase alone and a further 720-configuration search specifically for the physics-informed network, a considerable number of ideas were tested and set aside once they failed to improve genuinely held-out accuracy. Table 5 summarizes the ones most worth recording, precisely because a negative result, tested honestly, is still useful evidence about what does not work for this problem.</w:t>
+        <w:t>Putting Table 2 and Table 4 side by side, rather than reading each in isolation, surfaces a pattern neither table shows clearly on its own: the model or approach that wins is not always the one that wins everywhere else. Gradient boosting is the strongest model under three of the four validation strategies in Table 2, but under Strategy 3 specifically, the surface-wise split that withholds pin-fin pool-boiling and helical-coil rows entirely, Random Forest edges it out, 0.219 against 0.173, a real if modest reversal at the one strategy built specifically to test an unseen surface type. A similar reversal shows up in Table 4: the proposed hybrid wins on seven of the eight entirely unseen datasets, but on KAERI uniform specifically, the plain data-driven model with no physics scores higher, 0.852 against the hybrid's 0.735, even though the same plain data-driven model is far behind the hybrid on every other dataset in the table, including the non-uniform-heating KAERI set right next to it. Figure 10 makes both reversals visible at once.</w:t>
+      </w:r>
+    </w:p>
+    <w:p/>
+    <w:p>
+      <w:pPr>
+        <w:jc w:val="center"/>
+      </w:pPr>
+      <w:r>
+        <w:drawing>
+          <wp:inline xmlns:a="http://schemas.openxmlformats.org/drawingml/2006/main" xmlns:pic="http://schemas.openxmlformats.org/drawingml/2006/picture">
+            <wp:extent cx="5760720" cy="4578837"/>
+            <wp:docPr id="10" name="Picture 10"/>
+            <wp:cNvGraphicFramePr>
+              <a:graphicFrameLocks noChangeAspect="1"/>
+            </wp:cNvGraphicFramePr>
+            <a:graphic>
+              <a:graphicData uri="http://schemas.openxmlformats.org/drawingml/2006/picture">
+                <pic:pic>
+                  <pic:nvPicPr>
+                    <pic:cNvPr id="0" name="fig_best_by_scenario.png"/>
+                    <pic:cNvPicPr/>
+                  </pic:nvPicPr>
+                  <pic:blipFill>
+                    <a:blip r:embed="rId18"/>
+                    <a:stretch>
+                      <a:fillRect/>
+                    </a:stretch>
+                  </pic:blipFill>
+                  <pic:spPr>
+                    <a:xfrm>
+                      <a:off x="0" y="0"/>
+                      <a:ext cx="5760720" cy="4578837"/>
+                    </a:xfrm>
+                    <a:prstGeom prst="rect"/>
+                  </pic:spPr>
+                </pic:pic>
+              </a:graphicData>
+            </a:graphic>
+          </wp:inline>
+        </w:drawing>
+      </w:r>
+    </w:p>
+    <w:p>
+      <w:pPr>
+        <w:jc w:val="center"/>
+      </w:pPr>
+      <w:r>
+        <w:rPr>
+          <w:i/>
+          <w:sz w:val="18"/>
+        </w:rPr>
+        <w:t>Figure 10. Which model or approach actually wins, scenario by scenario, read directly off Table 2 (top) and Table 4 (bottom). Bracketed labels flag the two directly comparable heating configurations, KAERI uniform and KAERI non-uniform, so that a single dataset pair matched on almost everything except axial heating profile can be compared directly.</w:t>
+      </w:r>
+    </w:p>
+    <w:p>
+      <w:r>
+        <w:t>Other models and configurations explored. The five models above are the headline comparison; Table 5 briefly records the other ideas tried and set aside, negative results included, since they are still useful evidence about what does not work for this problem.</w:t>
       </w:r>
     </w:p>
     <w:p>
@@ -3756,7 +4044,7 @@
     <w:p/>
     <w:p>
       <w:r>
-        <w:t>The one modification out of eleven tested in this particular round that was actually adopted was not a modeling idea at all: it was correcting a fabricated placeholder value in one dataset's diameter column, already described in Section 1.8. Across this entire project, that pattern held up more often than not: fixing what the data actually said tended to matter more than which model, loss function, or architecture was used to fit it.</w:t>
+        <w:t>The one change from this round that actually stuck was not a modeling idea at all: correcting a fabricated placeholder in one dataset's diameter column (Section 1.8) -- fixing the data mattered more, more often, than any model, loss, or architecture choice.</w:t>
       </w:r>
     </w:p>
     <w:p>
@@ -4052,7 +4340,7 @@
         <w:drawing>
           <wp:inline xmlns:a="http://schemas.openxmlformats.org/drawingml/2006/main" xmlns:pic="http://schemas.openxmlformats.org/drawingml/2006/picture">
             <wp:extent cx="4206240" cy="5824844"/>
-            <wp:docPr id="6" name="Picture 6"/>
+            <wp:docPr id="11" name="Picture 11"/>
             <wp:cNvGraphicFramePr>
               <a:graphicFrameLocks noChangeAspect="1"/>
             </wp:cNvGraphicFramePr>
@@ -4064,7 +4352,7 @@
                     <pic:cNvPicPr/>
                   </pic:nvPicPr>
                   <pic:blipFill>
-                    <a:blip r:embed="rId14"/>
+                    <a:blip r:embed="rId19"/>
                     <a:stretch>
                       <a:fillRect/>
                     </a:stretch>
@@ -4092,7 +4380,7 @@
           <w:i/>
           <w:sz w:val="18"/>
         </w:rPr>
-        <w:t>Figure 6. Table 6 shown as a schematic: raw inputs flow down through all five layers to a final prediction with a calibrated uncertainty interval.</w:t>
+        <w:t>Figure 11. Table 6 shown as a schematic: raw inputs flow down through all five layers to a final prediction with a calibrated uncertainty interval.</w:t>
       </w:r>
     </w:p>
     <w:p>
@@ -4552,6 +4840,58 @@
       </w:tr>
     </w:tbl>
     <w:p/>
+    <w:p/>
+    <w:p>
+      <w:pPr>
+        <w:jc w:val="center"/>
+      </w:pPr>
+      <w:r>
+        <w:drawing>
+          <wp:inline xmlns:a="http://schemas.openxmlformats.org/drawingml/2006/main" xmlns:pic="http://schemas.openxmlformats.org/drawingml/2006/picture">
+            <wp:extent cx="5120640" cy="4554703"/>
+            <wp:docPr id="12" name="Picture 12"/>
+            <wp:cNvGraphicFramePr>
+              <a:graphicFrameLocks noChangeAspect="1"/>
+            </wp:cNvGraphicFramePr>
+            <a:graphic>
+              <a:graphicData uri="http://schemas.openxmlformats.org/drawingml/2006/picture">
+                <pic:pic>
+                  <pic:nvPicPr>
+                    <pic:cNvPr id="0" name="fig_validation_strategies.png"/>
+                    <pic:cNvPicPr/>
+                  </pic:nvPicPr>
+                  <pic:blipFill>
+                    <a:blip r:embed="rId20"/>
+                    <a:stretch>
+                      <a:fillRect/>
+                    </a:stretch>
+                  </pic:blipFill>
+                  <pic:spPr>
+                    <a:xfrm>
+                      <a:off x="0" y="0"/>
+                      <a:ext cx="5120640" cy="4554703"/>
+                    </a:xfrm>
+                    <a:prstGeom prst="rect"/>
+                  </pic:spPr>
+                </pic:pic>
+              </a:graphicData>
+            </a:graphic>
+          </wp:inline>
+        </w:drawing>
+      </w:r>
+    </w:p>
+    <w:p>
+      <w:pPr>
+        <w:jc w:val="center"/>
+      </w:pPr>
+      <w:r>
+        <w:rPr>
+          <w:i/>
+          <w:sz w:val="18"/>
+        </w:rPr>
+        <w:t>Figure 12. What train and test actually mean under each of the four validation strategies in Table 8, schematically: colored blocks are sources, dark segments are held out as test.</w:t>
+      </w:r>
+    </w:p>
     <w:p>
       <w:r>
         <w:t>Two further points about how these strategies were implemented are worth recording, because both were discovered as mistakes and then fixed, and both are the kind of error that is easy to make without noticing. First, after building these splits, this project added an automatic check for degenerate groupings: a Strategy III or Strategy IV split where every group happens to contain only one row is silently identical to a random split, and a split where one group exceeds 95 percent purity from a single source is effectively Strategy IV wearing Strategy III's label. Both of these had, in fact, occurred earlier in this project and been reported as if they were the intended, harder protocol, until the automatic check caught them. Second, three grouped splits used at one point were labelled as testing generalization to an unseen laboratory when the grouping column they used actually corresponded to something else entirely, a pressure range in one case and individual coil geometries in another, both audited and renamed once discovered. Neither error changed the paper's overall conclusions, since the same pattern, strong scores on easy splits and weak or collapsing scores on hard ones, showed up consistently regardless, but both are recorded here because a validation strategy that is not actually testing what its name claims is a quiet way for an otherwise careful project to end up overstating how well a model generalizes.</w:t>
@@ -5091,6 +5431,58 @@
         <w:t>Two things stand out that R-squared by itself does not show. First, gradient boosting is not only the most accurate model here, it is also nearly the fastest to train, at under two seconds, second only to Gaussian process regression's 0.8 seconds, which is far less accurate. There is no accuracy-versus-cost trade-off to argue about in this comparison: the best model is also one of the cheapest. Second, the physics-informed neural network is both the slowest model to train, at 11.5 seconds, and, as Section 3.2 already discussed, one of the least reliable once the split gets harder, which is a difficult combination to justify in practice.</w:t>
       </w:r>
     </w:p>
+    <w:p/>
+    <w:p>
+      <w:pPr>
+        <w:jc w:val="center"/>
+      </w:pPr>
+      <w:r>
+        <w:drawing>
+          <wp:inline xmlns:a="http://schemas.openxmlformats.org/drawingml/2006/main" xmlns:pic="http://schemas.openxmlformats.org/drawingml/2006/picture">
+            <wp:extent cx="4572000" cy="2680941"/>
+            <wp:docPr id="13" name="Picture 13"/>
+            <wp:cNvGraphicFramePr>
+              <a:graphicFrameLocks noChangeAspect="1"/>
+            </wp:cNvGraphicFramePr>
+            <a:graphic>
+              <a:graphicData uri="http://schemas.openxmlformats.org/drawingml/2006/picture">
+                <pic:pic>
+                  <pic:nvPicPr>
+                    <pic:cNvPr id="0" name="fig_accuracy_vs_cost.png"/>
+                    <pic:cNvPicPr/>
+                  </pic:nvPicPr>
+                  <pic:blipFill>
+                    <a:blip r:embed="rId21"/>
+                    <a:stretch>
+                      <a:fillRect/>
+                    </a:stretch>
+                  </pic:blipFill>
+                  <pic:spPr>
+                    <a:xfrm>
+                      <a:off x="0" y="0"/>
+                      <a:ext cx="4572000" cy="2680941"/>
+                    </a:xfrm>
+                    <a:prstGeom prst="rect"/>
+                  </pic:spPr>
+                </pic:pic>
+              </a:graphicData>
+            </a:graphic>
+          </wp:inline>
+        </w:drawing>
+      </w:r>
+    </w:p>
+    <w:p>
+      <w:pPr>
+        <w:jc w:val="center"/>
+      </w:pPr>
+      <w:r>
+        <w:rPr>
+          <w:i/>
+          <w:sz w:val="18"/>
+        </w:rPr>
+        <w:t>Figure 13. Table 9 as an accuracy-vs-cost view: R-squared against training time (log scale), marker size scaled to MAPE. There is no trade-off to argue about here, the most accurate model is also nearly the cheapest to train.</w:t>
+      </w:r>
+    </w:p>
     <w:p>
       <w:r>
         <w:t>This project's own MLP and Transformer architectures were evaluated the same way, on the separate NRC-derived interpolation and extrapolation splits described in Section 3.4, and training time turns out to matter even more there because of the gap between the two architectures.</w:t>
@@ -5599,6 +5991,58 @@
         <w:t>The Transformer's accuracy advantage over the MLP is real but small, an R-squared gain of about 0.005 to 0.006 in both splits, while its training cost is thirty to forty times higher. Whether that trade is worth making depends entirely on the application: for a one-off research comparison the cost is trivial, but for a pipeline meant to be retrained often, on new data or with low-rank adapters as described in Section 3.3, the MLP's efficiency is difficult to ignore. This is part of why the proposed hierarchy in Section 3.3 is built around a lightweight, pooled correction rather than the largest architecture available: past a certain point, more parameters bought this project very little additional accuracy for a considerable increase in cost.</w:t>
       </w:r>
     </w:p>
+    <w:p/>
+    <w:p>
+      <w:pPr>
+        <w:jc w:val="center"/>
+      </w:pPr>
+      <w:r>
+        <w:drawing>
+          <wp:inline xmlns:a="http://schemas.openxmlformats.org/drawingml/2006/main" xmlns:pic="http://schemas.openxmlformats.org/drawingml/2006/picture">
+            <wp:extent cx="5760720" cy="2370450"/>
+            <wp:docPr id="14" name="Picture 14"/>
+            <wp:cNvGraphicFramePr>
+              <a:graphicFrameLocks noChangeAspect="1"/>
+            </wp:cNvGraphicFramePr>
+            <a:graphic>
+              <a:graphicData uri="http://schemas.openxmlformats.org/drawingml/2006/picture">
+                <pic:pic>
+                  <pic:nvPicPr>
+                    <pic:cNvPr id="0" name="fig_mlp_transformer_within10.png"/>
+                    <pic:cNvPicPr/>
+                  </pic:nvPicPr>
+                  <pic:blipFill>
+                    <a:blip r:embed="rId22"/>
+                    <a:stretch>
+                      <a:fillRect/>
+                    </a:stretch>
+                  </pic:blipFill>
+                  <pic:spPr>
+                    <a:xfrm>
+                      <a:off x="0" y="0"/>
+                      <a:ext cx="5760720" cy="2370450"/>
+                    </a:xfrm>
+                    <a:prstGeom prst="rect"/>
+                  </pic:spPr>
+                </pic:pic>
+              </a:graphicData>
+            </a:graphic>
+          </wp:inline>
+        </w:drawing>
+      </w:r>
+    </w:p>
+    <w:p>
+      <w:pPr>
+        <w:jc w:val="center"/>
+      </w:pPr>
+      <w:r>
+        <w:rPr>
+          <w:i/>
+          <w:sz w:val="18"/>
+        </w:rPr>
+        <w:t>Figure 14. Table 10 shown visually: R-squared (left) and within +/-10% accuracy (right) for MLP and Transformer, interpolation vs. extrapolation. The Transformer's small R-squared edge does not carry over to within +/-10% accuracy, where the MLP matches or beats it under extrapolation for a fraction of the training cost.</w:t>
+      </w:r>
+    </w:p>
     <w:p>
       <w:pPr>
         <w:pStyle w:val="Heading2"/>
@@ -5609,7 +6053,7 @@
     </w:p>
     <w:p>
       <w:r>
-        <w:t>A table of summary metrics is easy to skim past without noticing what it actually implies about individual predictions. A parity plot, measured CHF on one axis and predicted CHF on the other, with a diagonal line marking a perfect match, makes the same information impossible to skim past: every point off the diagonal is a specific case the model got wrong, by a specific amount. Figure 7 shows this project's own MLP model, evaluated on real test-set rows it was not trained on, for both the interpolation and extrapolation splits described in Section 3.4.</w:t>
+        <w:t>A table of summary metrics is easy to skim past without noticing what it actually implies about individual predictions. A parity plot, measured CHF on one axis and predicted CHF on the other, with a diagonal line marking a perfect match, makes the same information impossible to skim past: every point off the diagonal is a specific case the model got wrong, by a specific amount. Figure 15 shows this project's own MLP model, evaluated on real test-set rows it was not trained on, for both the interpolation and extrapolation splits described in Section 3.4.</w:t>
       </w:r>
     </w:p>
     <w:p/>
@@ -5621,7 +6065,7 @@
         <w:drawing>
           <wp:inline xmlns:a="http://schemas.openxmlformats.org/drawingml/2006/main" xmlns:pic="http://schemas.openxmlformats.org/drawingml/2006/picture">
             <wp:extent cx="5760720" cy="2342179"/>
-            <wp:docPr id="7" name="Picture 7"/>
+            <wp:docPr id="15" name="Picture 15"/>
             <wp:cNvGraphicFramePr>
               <a:graphicFrameLocks noChangeAspect="1"/>
             </wp:cNvGraphicFramePr>
@@ -5633,7 +6077,7 @@
                     <pic:cNvPicPr/>
                   </pic:nvPicPr>
                   <pic:blipFill>
-                    <a:blip r:embed="rId15"/>
+                    <a:blip r:embed="rId23"/>
                     <a:stretch>
                       <a:fillRect/>
                     </a:stretch>
@@ -5661,17 +6105,17 @@
           <w:i/>
           <w:sz w:val="18"/>
         </w:rPr>
-        <w:t>Figure 7. Predicted vs. measured CHF for this project's own MLP model, on real held-out test rows. Both axes are log scaled because CHF spans three orders of magnitude. The dashed lines mark a +/-10% error band around perfect prediction.</w:t>
+        <w:t>Figure 15. Predicted vs. measured CHF for this project's own MLP model, on real held-out test rows. Both axes are log scaled because CHF spans three orders of magnitude. The dashed lines mark a +/-10% error band around perfect prediction.</w:t>
       </w:r>
     </w:p>
     <w:p>
       <w:r>
-        <w:t>Two patterns are visible in Figure 7 that a single R-squared number would not show. First, scatter around the diagonal is not uniform across the range: low-CHF points show proportionally more spread than high-CHF points, which is consistent with the fact that MAPE, a percentage-based metric, penalizes a fixed absolute error far more heavily at low CHF than at high CHF. Second, the extrapolation panel shows visibly more points sitting outside the +/-10% band, and a small cluster of clearly underpredicted points around 300 to 500 kW/m2 that does not have an equivalent in the interpolation panel, a direct, visual version of the interpolation-versus-extrapolation gap already quantified numerically throughout this paper. It is also worth being transparent about a smaller point: this specific run reached an R-squared of 0.951 and 0.923 on interpolation and extrapolation respectively, both close to but not identical to the 0.951 and 0.838 reported from the original multi-configuration run in Table 10. That difference between two honestly run instances of the same architecture on the same data is itself a small demonstration of the point made in Section 1.8 about why every number in this paper is meant to be read as a multi-seed estimate, not a single fixed value.</w:t>
+        <w:t>Two patterns are visible in Figure 15 that a single R-squared number would not show. First, scatter around the diagonal is not uniform across the range: low-CHF points show proportionally more spread than high-CHF points, which is consistent with the fact that MAPE, a percentage-based metric, penalizes a fixed absolute error far more heavily at low CHF than at high CHF. Second, the extrapolation panel shows visibly more points sitting outside the +/-10% band, and a small cluster of clearly underpredicted points around 300 to 500 kW/m2 that does not have an equivalent in the interpolation panel, a direct, visual version of the interpolation-versus-extrapolation gap already quantified numerically throughout this paper. It is also worth being transparent about a smaller point: this specific run reached an R-squared of 0.951 and 0.923 on interpolation and extrapolation respectively, both close to but not identical to the 0.951 and 0.838 reported from the original multi-configuration run in Table 10. That difference between two honestly run instances of the same architecture on the same data is itself a small demonstration of the point made in Section 1.8 about why every number in this paper is meant to be read as a multi-seed estimate, not a single fixed value.</w:t>
       </w:r>
     </w:p>
     <w:p>
       <w:r>
-        <w:t>The same experimental-versus-predicted comparison, aggregated to a single R-squared and a single within-+/-10% percentage per dataset rather than shown point by point, is what Figure 5 in Section 3.2 already presents for the proposed hybrid pipeline across every entirely unseen dataset tested in this paper. Reading Figure 5 and Figure 7 together is the intended way to judge this paper's results: Figure 7 shows what individual predictions look like for a model evaluated the conventional way, and Figure 5 shows how much of that accuracy survives once the test data comes from a source, surface, or fluid the model has never encountered.</w:t>
+        <w:t>The same experimental-versus-predicted comparison, aggregated to a single R-squared and a single within-+/-10% percentage per dataset rather than shown point by point, is what Figure 9 in Section 3.2 already presents for the proposed hybrid pipeline across every entirely unseen dataset tested in this paper. Reading Figure 9 and Figure 15 together is the intended way to judge this paper's results: Figure 15 shows what individual predictions look like for a model evaluated the conventional way, and Figure 9 shows how much of that accuracy survives once the test data comes from a source, surface, or fluid the model has never encountered.</w:t>
       </w:r>
     </w:p>
     <w:p>

</xml_diff>